<commit_message>
Backup toàn bộ trạng thái hiện tại: pipeline GEMS + Bài 28 V1/V2/V3
Snapshot an toàn cho toàn bộ dự án soạn tài liệu tại thời điểm hiện tại,
gồm package gems/, tài liệu tham khảo, và output/ (Bài 28 V1/V2/V3 với
đầy đủ KHBD/PHT/Bài tập về nhà/Slide NotebookLM).

Co-Authored-By: Claude Sonnet 5 <noreply@anthropic.com>
</commit_message>
<xml_diff>
--- a/output/bai4_nhiet_dung_rieng/ready/bai4_nhiet_dung_rieng_ke_hoach_bai_day.docx
+++ b/output/bai4_nhiet_dung_rieng/ready/bai4_nhiet_dung_rieng_ke_hoach_bai_day.docx
@@ -2,21 +2,1913 @@
 <file path=word/document.xml><?xml version="1.0" encoding="utf-8"?>
 <w:document xmlns:wpc="http://schemas.microsoft.com/office/word/2010/wordprocessingCanvas" xmlns:mo="http://schemas.microsoft.com/office/mac/office/2008/main" xmlns:mc="http://schemas.openxmlformats.org/markup-compatibility/2006" xmlns:mv="urn:schemas-microsoft-com:mac:vml" xmlns:o="urn:schemas-microsoft-com:office:office" xmlns:r="http://schemas.openxmlformats.org/officeDocument/2006/relationships" xmlns:m="http://schemas.openxmlformats.org/officeDocument/2006/math" xmlns:v="urn:schemas-microsoft-com:vml" xmlns:wp14="http://schemas.microsoft.com/office/word/2010/wordprocessingDrawing" xmlns:wp="http://schemas.openxmlformats.org/drawingml/2006/wordprocessingDrawing" xmlns:w10="urn:schemas-microsoft-com:office:word" xmlns:w="http://schemas.openxmlformats.org/wordprocessingml/2006/main" xmlns:w14="http://schemas.microsoft.com/office/word/2010/wordml" xmlns:wpg="http://schemas.microsoft.com/office/word/2010/wordprocessingGroup" xmlns:wpi="http://schemas.microsoft.com/office/word/2010/wordprocessingInk" xmlns:wne="http://schemas.microsoft.com/office/word/2006/wordml" xmlns:wps="http://schemas.microsoft.com/office/word/2010/wordprocessingShape" mc:Ignorable="w14 wp14">
   <w:body>
+    <w:p>
+      <w:pPr>
+        <w:spacing w:after="40" w:line="276" w:lineRule="auto"/>
+        <w:jc w:val="left"/>
+      </w:pPr>
+      <w:r>
+        <w:rPr>
+          <w:rFonts w:ascii="Times New Roman" w:hAnsi="Times New Roman"/>
+          <w:color w:val="000000"/>
+          <w:sz w:val="22"/>
+        </w:rPr>
+        <w:t>Trường: ................................................</w:t>
+        <w:br/>
+      </w:r>
+      <w:r>
+        <w:rPr>
+          <w:rFonts w:ascii="Times New Roman" w:hAnsi="Times New Roman"/>
+          <w:i/>
+          <w:color w:val="666666"/>
+          <w:sz w:val="22"/>
+        </w:rPr>
+        <w:t>Tổ: Tổ Vật lí - Công nghệ</w:t>
+      </w:r>
+    </w:p>
+    <w:p>
+      <w:pPr>
+        <w:keepNext/>
+        <w:spacing w:before="240" w:after="240"/>
+        <w:jc w:val="center"/>
+      </w:pPr>
+      <w:r>
+        <w:rPr>
+          <w:rFonts w:ascii="Times New Roman" w:hAnsi="Times New Roman"/>
+          <w:b/>
+          <w:color w:val="1F4E79"/>
+          <w:sz w:val="32"/>
+        </w:rPr>
+        <w:t>KẾ HOẠCH BÀI DẠY</w:t>
+      </w:r>
+    </w:p>
+    <w:p>
+      <w:pPr>
+        <w:spacing w:after="160"/>
+        <w:jc w:val="center"/>
+      </w:pPr>
+      <w:r>
+        <w:rPr>
+          <w:rFonts w:ascii="Times New Roman" w:hAnsi="Times New Roman"/>
+          <w:i/>
+          <w:color w:val="666666"/>
+          <w:sz w:val="22"/>
+        </w:rPr>
+        <w:t>(Kèm theo Công văn số 5512/BGDĐT-GDTrH ngày 18/12/2020 của Bộ GDĐT)</w:t>
+      </w:r>
+    </w:p>
     <w:tbl>
       <w:tblPr>
-        <w:tblW w:type="auto" w:w="0"/>
         <w:jc w:val="center"/>
-        <w:tblLayout w:type="autofit"/>
         <w:tblLook w:firstColumn="1" w:firstRow="1" w:lastColumn="0" w:lastRow="0" w:noHBand="0" w:noVBand="1" w:val="04A0"/>
+        <w:tblW w:w="9072" w:type="dxa"/>
       </w:tblPr>
       <w:tblGrid>
-        <w:gridCol w:w="4677"/>
-        <w:gridCol w:w="4677"/>
+        <w:gridCol w:w="2268"/>
+        <w:gridCol w:w="2268"/>
+        <w:gridCol w:w="2268"/>
+        <w:gridCol w:w="2268"/>
       </w:tblGrid>
       <w:tr>
+        <w:trPr>
+          <w:cantSplit/>
+        </w:trPr>
         <w:tc>
           <w:tcPr>
-            <w:tcW w:type="dxa" w:w="4677"/>
+            <w:tcW w:type="dxa" w:w="2268"/>
+            <w:tcMar>
+              <w:top w:w="100" w:type="dxa"/>
+              <w:bottom w:w="100" w:type="dxa"/>
+              <w:left w:w="100" w:type="dxa"/>
+              <w:right w:w="100" w:type="dxa"/>
+            </w:tcMar>
+            <w:tcBorders>
+              <w:top w:val="single" w:sz="4" w:space="0" w:color="BFBFBF"/>
+              <w:left w:val="single" w:sz="4" w:space="0" w:color="BFBFBF"/>
+              <w:bottom w:val="single" w:sz="4" w:space="0" w:color="BFBFBF"/>
+              <w:right w:val="single" w:sz="4" w:space="0" w:color="BFBFBF"/>
+            </w:tcBorders>
+          </w:tcPr>
+          <w:p>
+            <w:pPr>
+              <w:spacing w:before="60" w:after="60"/>
+              <w:ind w:left="113"/>
+            </w:pPr>
+            <w:r>
+              <w:rPr>
+                <w:rFonts w:ascii="Times New Roman" w:hAnsi="Times New Roman"/>
+                <w:b/>
+                <w:color w:val="000000"/>
+                <w:sz w:val="22"/>
+              </w:rPr>
+              <w:t>Họ và tên GV:</w:t>
+            </w:r>
+          </w:p>
+        </w:tc>
+        <w:tc>
+          <w:tcPr>
+            <w:tcW w:type="dxa" w:w="2268"/>
+            <w:tcMar>
+              <w:top w:w="100" w:type="dxa"/>
+              <w:bottom w:w="100" w:type="dxa"/>
+              <w:left w:w="100" w:type="dxa"/>
+              <w:right w:w="100" w:type="dxa"/>
+            </w:tcMar>
+            <w:tcBorders>
+              <w:top w:val="single" w:sz="4" w:space="0" w:color="BFBFBF"/>
+              <w:left w:val="single" w:sz="4" w:space="0" w:color="BFBFBF"/>
+              <w:bottom w:val="single" w:sz="4" w:space="0" w:color="BFBFBF"/>
+              <w:right w:val="single" w:sz="4" w:space="0" w:color="BFBFBF"/>
+            </w:tcBorders>
+          </w:tcPr>
+          <w:p>
+            <w:pPr>
+              <w:spacing w:before="60" w:after="60"/>
+              <w:ind w:left="113"/>
+            </w:pPr>
+            <w:r>
+              <w:rPr>
+                <w:rFonts w:ascii="Times New Roman" w:hAnsi="Times New Roman"/>
+                <w:b w:val="0"/>
+                <w:color w:val="000000"/>
+                <w:sz w:val="22"/>
+              </w:rPr>
+              <w:t>Kha Khung Hiệp</w:t>
+            </w:r>
+          </w:p>
+        </w:tc>
+        <w:tc>
+          <w:tcPr>
+            <w:tcW w:type="dxa" w:w="2268"/>
+            <w:tcMar>
+              <w:top w:w="100" w:type="dxa"/>
+              <w:bottom w:w="100" w:type="dxa"/>
+              <w:left w:w="100" w:type="dxa"/>
+              <w:right w:w="100" w:type="dxa"/>
+            </w:tcMar>
+            <w:tcBorders>
+              <w:top w:val="single" w:sz="4" w:space="0" w:color="BFBFBF"/>
+              <w:left w:val="single" w:sz="4" w:space="0" w:color="BFBFBF"/>
+              <w:bottom w:val="single" w:sz="4" w:space="0" w:color="BFBFBF"/>
+              <w:right w:val="single" w:sz="4" w:space="0" w:color="BFBFBF"/>
+            </w:tcBorders>
+          </w:tcPr>
+          <w:p>
+            <w:pPr>
+              <w:spacing w:before="60" w:after="60"/>
+              <w:ind w:left="113"/>
+            </w:pPr>
+            <w:r>
+              <w:rPr>
+                <w:rFonts w:ascii="Times New Roman" w:hAnsi="Times New Roman"/>
+                <w:b/>
+                <w:color w:val="000000"/>
+                <w:sz w:val="22"/>
+              </w:rPr>
+              <w:t>Môn học:</w:t>
+            </w:r>
+          </w:p>
+        </w:tc>
+        <w:tc>
+          <w:tcPr>
+            <w:tcW w:type="dxa" w:w="2268"/>
+            <w:tcMar>
+              <w:top w:w="100" w:type="dxa"/>
+              <w:bottom w:w="100" w:type="dxa"/>
+              <w:left w:w="100" w:type="dxa"/>
+              <w:right w:w="100" w:type="dxa"/>
+            </w:tcMar>
+            <w:tcBorders>
+              <w:top w:val="single" w:sz="4" w:space="0" w:color="BFBFBF"/>
+              <w:left w:val="single" w:sz="4" w:space="0" w:color="BFBFBF"/>
+              <w:bottom w:val="single" w:sz="4" w:space="0" w:color="BFBFBF"/>
+              <w:right w:val="single" w:sz="4" w:space="0" w:color="BFBFBF"/>
+            </w:tcBorders>
+          </w:tcPr>
+          <w:p>
+            <w:pPr>
+              <w:spacing w:before="60" w:after="60"/>
+              <w:ind w:left="113"/>
+            </w:pPr>
+            <w:r>
+              <w:rPr>
+                <w:rFonts w:ascii="Times New Roman" w:hAnsi="Times New Roman"/>
+                <w:b w:val="0"/>
+                <w:color w:val="000000"/>
+                <w:sz w:val="22"/>
+              </w:rPr>
+              <w:t>Vật lí</w:t>
+            </w:r>
+          </w:p>
+        </w:tc>
+      </w:tr>
+      <w:tr>
+        <w:trPr>
+          <w:cantSplit/>
+        </w:trPr>
+        <w:tc>
+          <w:tcPr>
+            <w:tcW w:type="dxa" w:w="2268"/>
+            <w:tcMar>
+              <w:top w:w="100" w:type="dxa"/>
+              <w:bottom w:w="100" w:type="dxa"/>
+              <w:left w:w="100" w:type="dxa"/>
+              <w:right w:w="100" w:type="dxa"/>
+            </w:tcMar>
+            <w:tcBorders>
+              <w:top w:val="single" w:sz="4" w:space="0" w:color="BFBFBF"/>
+              <w:left w:val="single" w:sz="4" w:space="0" w:color="BFBFBF"/>
+              <w:bottom w:val="single" w:sz="4" w:space="0" w:color="BFBFBF"/>
+              <w:right w:val="single" w:sz="4" w:space="0" w:color="BFBFBF"/>
+            </w:tcBorders>
+          </w:tcPr>
+          <w:p>
+            <w:pPr>
+              <w:spacing w:before="60" w:after="60"/>
+              <w:ind w:left="113"/>
+            </w:pPr>
+            <w:r>
+              <w:rPr>
+                <w:rFonts w:ascii="Times New Roman" w:hAnsi="Times New Roman"/>
+                <w:b/>
+                <w:color w:val="000000"/>
+                <w:sz w:val="22"/>
+              </w:rPr>
+              <w:t>Tên bài dạy:</w:t>
+            </w:r>
+          </w:p>
+        </w:tc>
+        <w:tc>
+          <w:tcPr>
+            <w:tcW w:type="dxa" w:w="2268"/>
+            <w:tcMar>
+              <w:top w:w="100" w:type="dxa"/>
+              <w:bottom w:w="100" w:type="dxa"/>
+              <w:left w:w="100" w:type="dxa"/>
+              <w:right w:w="100" w:type="dxa"/>
+            </w:tcMar>
+            <w:tcBorders>
+              <w:top w:val="single" w:sz="4" w:space="0" w:color="BFBFBF"/>
+              <w:left w:val="single" w:sz="4" w:space="0" w:color="BFBFBF"/>
+              <w:bottom w:val="single" w:sz="4" w:space="0" w:color="BFBFBF"/>
+              <w:right w:val="single" w:sz="4" w:space="0" w:color="BFBFBF"/>
+            </w:tcBorders>
+          </w:tcPr>
+          <w:p>
+            <w:pPr>
+              <w:spacing w:before="60" w:after="60"/>
+              <w:ind w:left="113"/>
+            </w:pPr>
+            <w:r>
+              <w:rPr>
+                <w:rFonts w:ascii="Times New Roman" w:hAnsi="Times New Roman"/>
+                <w:b w:val="0"/>
+                <w:color w:val="000000"/>
+                <w:sz w:val="22"/>
+              </w:rPr>
+              <w:t>Bài 4 - Nhiệt dung riêng</w:t>
+            </w:r>
+          </w:p>
+        </w:tc>
+        <w:tc>
+          <w:tcPr>
+            <w:tcW w:type="dxa" w:w="2268"/>
+            <w:tcMar>
+              <w:top w:w="100" w:type="dxa"/>
+              <w:bottom w:w="100" w:type="dxa"/>
+              <w:left w:w="100" w:type="dxa"/>
+              <w:right w:w="100" w:type="dxa"/>
+            </w:tcMar>
+            <w:tcBorders>
+              <w:top w:val="single" w:sz="4" w:space="0" w:color="BFBFBF"/>
+              <w:left w:val="single" w:sz="4" w:space="0" w:color="BFBFBF"/>
+              <w:bottom w:val="single" w:sz="4" w:space="0" w:color="BFBFBF"/>
+              <w:right w:val="single" w:sz="4" w:space="0" w:color="BFBFBF"/>
+            </w:tcBorders>
+          </w:tcPr>
+          <w:p>
+            <w:pPr>
+              <w:spacing w:before="60" w:after="60"/>
+              <w:ind w:left="113"/>
+            </w:pPr>
+            <w:r>
+              <w:rPr>
+                <w:rFonts w:ascii="Times New Roman" w:hAnsi="Times New Roman"/>
+                <w:b/>
+                <w:color w:val="000000"/>
+                <w:sz w:val="22"/>
+              </w:rPr>
+              <w:t>Lớp:</w:t>
+            </w:r>
+          </w:p>
+        </w:tc>
+        <w:tc>
+          <w:tcPr>
+            <w:tcW w:type="dxa" w:w="2268"/>
+            <w:tcMar>
+              <w:top w:w="100" w:type="dxa"/>
+              <w:bottom w:w="100" w:type="dxa"/>
+              <w:left w:w="100" w:type="dxa"/>
+              <w:right w:w="100" w:type="dxa"/>
+            </w:tcMar>
+            <w:tcBorders>
+              <w:top w:val="single" w:sz="4" w:space="0" w:color="BFBFBF"/>
+              <w:left w:val="single" w:sz="4" w:space="0" w:color="BFBFBF"/>
+              <w:bottom w:val="single" w:sz="4" w:space="0" w:color="BFBFBF"/>
+              <w:right w:val="single" w:sz="4" w:space="0" w:color="BFBFBF"/>
+            </w:tcBorders>
+          </w:tcPr>
+          <w:p>
+            <w:pPr>
+              <w:spacing w:before="60" w:after="60"/>
+              <w:ind w:left="113"/>
+            </w:pPr>
+            <w:r>
+              <w:rPr>
+                <w:rFonts w:ascii="Times New Roman" w:hAnsi="Times New Roman"/>
+                <w:b w:val="0"/>
+                <w:color w:val="000000"/>
+                <w:sz w:val="22"/>
+              </w:rPr>
+              <w:t>12</w:t>
+            </w:r>
+          </w:p>
+        </w:tc>
+      </w:tr>
+      <w:tr>
+        <w:trPr>
+          <w:cantSplit/>
+        </w:trPr>
+        <w:tc>
+          <w:tcPr>
+            <w:tcW w:type="dxa" w:w="2268"/>
+            <w:tcMar>
+              <w:top w:w="100" w:type="dxa"/>
+              <w:bottom w:w="100" w:type="dxa"/>
+              <w:left w:w="100" w:type="dxa"/>
+              <w:right w:w="100" w:type="dxa"/>
+            </w:tcMar>
+            <w:tcBorders>
+              <w:top w:val="single" w:sz="4" w:space="0" w:color="BFBFBF"/>
+              <w:left w:val="single" w:sz="4" w:space="0" w:color="BFBFBF"/>
+              <w:bottom w:val="single" w:sz="4" w:space="0" w:color="BFBFBF"/>
+              <w:right w:val="single" w:sz="4" w:space="0" w:color="BFBFBF"/>
+            </w:tcBorders>
+          </w:tcPr>
+          <w:p>
+            <w:pPr>
+              <w:spacing w:before="60" w:after="60"/>
+              <w:ind w:left="113"/>
+            </w:pPr>
+            <w:r>
+              <w:rPr>
+                <w:rFonts w:ascii="Times New Roman" w:hAnsi="Times New Roman"/>
+                <w:b/>
+                <w:color w:val="000000"/>
+                <w:sz w:val="22"/>
+              </w:rPr>
+              <w:t>Thời gian thực hiện:</w:t>
+            </w:r>
+          </w:p>
+        </w:tc>
+        <w:tc>
+          <w:tcPr>
+            <w:tcW w:type="dxa" w:w="2268"/>
+            <w:tcMar>
+              <w:top w:w="100" w:type="dxa"/>
+              <w:bottom w:w="100" w:type="dxa"/>
+              <w:left w:w="100" w:type="dxa"/>
+              <w:right w:w="100" w:type="dxa"/>
+            </w:tcMar>
+            <w:tcBorders>
+              <w:top w:val="single" w:sz="4" w:space="0" w:color="BFBFBF"/>
+              <w:left w:val="single" w:sz="4" w:space="0" w:color="BFBFBF"/>
+              <w:bottom w:val="single" w:sz="4" w:space="0" w:color="BFBFBF"/>
+              <w:right w:val="single" w:sz="4" w:space="0" w:color="BFBFBF"/>
+            </w:tcBorders>
+          </w:tcPr>
+          <w:p>
+            <w:pPr>
+              <w:spacing w:before="60" w:after="60"/>
+              <w:ind w:left="113"/>
+            </w:pPr>
+            <w:r>
+              <w:rPr>
+                <w:rFonts w:ascii="Times New Roman" w:hAnsi="Times New Roman"/>
+                <w:b w:val="0"/>
+                <w:color w:val="000000"/>
+                <w:sz w:val="22"/>
+              </w:rPr>
+              <w:t>2 tiết</w:t>
+            </w:r>
+          </w:p>
+        </w:tc>
+        <w:tc>
+          <w:tcPr>
+            <w:tcW w:type="dxa" w:w="2268"/>
+            <w:tcMar>
+              <w:top w:w="100" w:type="dxa"/>
+              <w:bottom w:w="100" w:type="dxa"/>
+              <w:left w:w="100" w:type="dxa"/>
+              <w:right w:w="100" w:type="dxa"/>
+            </w:tcMar>
+            <w:tcBorders>
+              <w:top w:val="single" w:sz="4" w:space="0" w:color="BFBFBF"/>
+              <w:left w:val="single" w:sz="4" w:space="0" w:color="BFBFBF"/>
+              <w:bottom w:val="single" w:sz="4" w:space="0" w:color="BFBFBF"/>
+              <w:right w:val="single" w:sz="4" w:space="0" w:color="BFBFBF"/>
+            </w:tcBorders>
+          </w:tcPr>
+          <w:p>
+            <w:pPr>
+              <w:spacing w:before="60" w:after="60"/>
+              <w:ind w:left="113"/>
+            </w:pPr>
+            <w:r>
+              <w:rPr>
+                <w:rFonts w:ascii="Times New Roman" w:hAnsi="Times New Roman"/>
+                <w:b/>
+                <w:color w:val="000000"/>
+                <w:sz w:val="22"/>
+              </w:rPr>
+            </w:r>
+          </w:p>
+        </w:tc>
+        <w:tc>
+          <w:tcPr>
+            <w:tcW w:type="dxa" w:w="2268"/>
+            <w:tcMar>
+              <w:top w:w="100" w:type="dxa"/>
+              <w:bottom w:w="100" w:type="dxa"/>
+              <w:left w:w="100" w:type="dxa"/>
+              <w:right w:w="100" w:type="dxa"/>
+            </w:tcMar>
+            <w:tcBorders>
+              <w:top w:val="single" w:sz="4" w:space="0" w:color="BFBFBF"/>
+              <w:left w:val="single" w:sz="4" w:space="0" w:color="BFBFBF"/>
+              <w:bottom w:val="single" w:sz="4" w:space="0" w:color="BFBFBF"/>
+              <w:right w:val="single" w:sz="4" w:space="0" w:color="BFBFBF"/>
+            </w:tcBorders>
+          </w:tcPr>
+          <w:p>
+            <w:pPr>
+              <w:spacing w:before="60" w:after="60"/>
+              <w:ind w:left="113"/>
+            </w:pPr>
+            <w:r>
+              <w:rPr>
+                <w:rFonts w:ascii="Times New Roman" w:hAnsi="Times New Roman"/>
+                <w:b w:val="0"/>
+                <w:color w:val="000000"/>
+                <w:sz w:val="22"/>
+              </w:rPr>
+            </w:r>
+          </w:p>
+        </w:tc>
+      </w:tr>
+    </w:tbl>
+    <w:p/>
+    <w:p>
+      <w:pPr>
+        <w:pStyle w:val="Heading1"/>
+        <w:keepNext/>
+        <w:spacing w:before="240" w:after="120"/>
+        <w:ind w:left="0" w:firstLine="0"/>
+        <w:jc w:val="both"/>
+      </w:pPr>
+      <w:r>
+        <w:rPr>
+          <w:rFonts w:ascii="Times New Roman" w:hAnsi="Times New Roman"/>
+          <w:b/>
+          <w:i w:val="0"/>
+          <w:color w:val="1F4E79"/>
+          <w:sz w:val="28"/>
+        </w:rPr>
+        <w:t>I. YÊU CẦU CẦN ĐẠT</w:t>
+      </w:r>
+    </w:p>
+    <w:p>
+      <w:pPr>
+        <w:pStyle w:val="Heading2"/>
+        <w:keepNext/>
+        <w:spacing w:before="160" w:after="80"/>
+        <w:ind w:left="0" w:firstLine="0"/>
+        <w:jc w:val="both"/>
+      </w:pPr>
+      <w:r>
+        <w:rPr>
+          <w:rFonts w:ascii="Times New Roman" w:hAnsi="Times New Roman"/>
+          <w:b/>
+          <w:i w:val="0"/>
+          <w:color w:val="000000"/>
+          <w:sz w:val="26"/>
+        </w:rPr>
+        <w:t>1. Năng lực đặc thù (Vật lí)</w:t>
+      </w:r>
+    </w:p>
+    <w:p>
+      <w:pPr>
+        <w:spacing w:before="60" w:after="60" w:line="312" w:lineRule="auto"/>
+        <w:ind w:left="283" w:hanging="170"/>
+        <w:jc w:val="both"/>
+      </w:pPr>
+      <w:r>
+        <w:rPr>
+          <w:rFonts w:ascii="Times New Roman" w:hAnsi="Times New Roman"/>
+          <w:color w:val="000000"/>
+          <w:sz w:val="26"/>
+        </w:rPr>
+        <w:t xml:space="preserve">- </w:t>
+      </w:r>
+      <w:r>
+        <w:rPr>
+          <w:rFonts w:ascii="Times New Roman" w:hAnsi="Times New Roman"/>
+          <w:b w:val="0"/>
+          <w:i w:val="0"/>
+          <w:color w:val="000000"/>
+          <w:sz w:val="26"/>
+        </w:rPr>
+        <w:t>Năng lực vật lý mẫu</w:t>
+      </w:r>
+    </w:p>
+    <w:p>
+      <w:pPr>
+        <w:pStyle w:val="Heading2"/>
+        <w:keepNext/>
+        <w:spacing w:before="160" w:after="80"/>
+        <w:ind w:left="0" w:firstLine="0"/>
+        <w:jc w:val="both"/>
+      </w:pPr>
+      <w:r>
+        <w:rPr>
+          <w:rFonts w:ascii="Times New Roman" w:hAnsi="Times New Roman"/>
+          <w:b/>
+          <w:i w:val="0"/>
+          <w:color w:val="000000"/>
+          <w:sz w:val="26"/>
+        </w:rPr>
+        <w:t>2. Năng lực chung</w:t>
+      </w:r>
+    </w:p>
+    <w:p>
+      <w:pPr>
+        <w:spacing w:before="60" w:after="60" w:line="312" w:lineRule="auto"/>
+        <w:ind w:left="283" w:hanging="170"/>
+        <w:jc w:val="both"/>
+      </w:pPr>
+      <w:r>
+        <w:rPr>
+          <w:rFonts w:ascii="Times New Roman" w:hAnsi="Times New Roman"/>
+          <w:color w:val="000000"/>
+          <w:sz w:val="26"/>
+        </w:rPr>
+        <w:t xml:space="preserve">- </w:t>
+      </w:r>
+      <w:r>
+        <w:rPr>
+          <w:rFonts w:ascii="Times New Roman" w:hAnsi="Times New Roman"/>
+          <w:b w:val="0"/>
+          <w:i w:val="0"/>
+          <w:color w:val="000000"/>
+          <w:sz w:val="26"/>
+        </w:rPr>
+        <w:t>Năng lực tự học mẫu</w:t>
+      </w:r>
+    </w:p>
+    <w:p>
+      <w:pPr>
+        <w:pStyle w:val="Heading2"/>
+        <w:keepNext/>
+        <w:spacing w:before="160" w:after="80"/>
+        <w:ind w:left="0" w:firstLine="0"/>
+        <w:jc w:val="both"/>
+      </w:pPr>
+      <w:r>
+        <w:rPr>
+          <w:rFonts w:ascii="Times New Roman" w:hAnsi="Times New Roman"/>
+          <w:b/>
+          <w:i w:val="0"/>
+          <w:color w:val="000000"/>
+          <w:sz w:val="26"/>
+        </w:rPr>
+        <w:t>3. Năng lực số (Công văn 3456/BGDĐT-GDPT)</w:t>
+      </w:r>
+    </w:p>
+    <w:p>
+      <w:pPr>
+        <w:spacing w:before="60" w:after="60" w:line="312" w:lineRule="auto"/>
+        <w:ind w:left="283" w:hanging="170"/>
+        <w:jc w:val="both"/>
+      </w:pPr>
+      <w:r>
+        <w:rPr>
+          <w:rFonts w:ascii="Times New Roman" w:hAnsi="Times New Roman"/>
+          <w:color w:val="000000"/>
+          <w:sz w:val="26"/>
+        </w:rPr>
+        <w:t xml:space="preserve">- </w:t>
+      </w:r>
+      <w:r>
+        <w:rPr>
+          <w:rFonts w:ascii="Times New Roman" w:hAnsi="Times New Roman"/>
+          <w:b/>
+          <w:i w:val="0"/>
+          <w:color w:val="000000"/>
+          <w:sz w:val="26"/>
+        </w:rPr>
+        <w:t>1.2 — Đánh giá dữ liệu, thông tin và nội dung số:</w:t>
+      </w:r>
+      <w:r>
+        <w:rPr>
+          <w:rFonts w:ascii="Times New Roman" w:hAnsi="Times New Roman"/>
+          <w:b w:val="0"/>
+          <w:i w:val="0"/>
+          <w:color w:val="000000"/>
+          <w:sz w:val="26"/>
+        </w:rPr>
+        <w:t xml:space="preserve"> Đánh giá độ tin cậy của dữ liệu số và hướng dẫn bạn kiểm tra nguồn. </w:t>
+      </w:r>
+      <w:r>
+        <w:rPr>
+          <w:rFonts w:ascii="Times New Roman" w:hAnsi="Times New Roman"/>
+          <w:b/>
+          <w:i w:val="0"/>
+          <w:color w:val="000000"/>
+          <w:sz w:val="26"/>
+        </w:rPr>
+        <w:t>Minh chứng:</w:t>
+      </w:r>
+      <w:r>
+        <w:rPr>
+          <w:rFonts w:ascii="Times New Roman" w:hAnsi="Times New Roman"/>
+          <w:b w:val="0"/>
+          <w:i w:val="0"/>
+          <w:color w:val="000000"/>
+          <w:sz w:val="26"/>
+        </w:rPr>
+        <w:t xml:space="preserve"> Phiếu so sánh dữ liệu có liên kết và nhận xét nguồn.</w:t>
+      </w:r>
+    </w:p>
+    <w:p>
+      <w:pPr>
+        <w:pStyle w:val="Heading2"/>
+        <w:keepNext/>
+        <w:spacing w:before="160" w:after="80"/>
+        <w:ind w:left="0" w:firstLine="0"/>
+        <w:jc w:val="both"/>
+      </w:pPr>
+      <w:r>
+        <w:rPr>
+          <w:rFonts w:ascii="Times New Roman" w:hAnsi="Times New Roman"/>
+          <w:b/>
+          <w:i w:val="0"/>
+          <w:color w:val="000000"/>
+          <w:sz w:val="26"/>
+        </w:rPr>
+        <w:t>4. Phẩm chất</w:t>
+      </w:r>
+    </w:p>
+    <w:p>
+      <w:pPr>
+        <w:spacing w:before="60" w:after="60" w:line="312" w:lineRule="auto"/>
+        <w:ind w:left="283" w:hanging="170"/>
+        <w:jc w:val="both"/>
+      </w:pPr>
+      <w:r>
+        <w:rPr>
+          <w:rFonts w:ascii="Times New Roman" w:hAnsi="Times New Roman"/>
+          <w:color w:val="000000"/>
+          <w:sz w:val="26"/>
+        </w:rPr>
+        <w:t xml:space="preserve">- </w:t>
+      </w:r>
+      <w:r>
+        <w:rPr>
+          <w:rFonts w:ascii="Times New Roman" w:hAnsi="Times New Roman"/>
+          <w:b w:val="0"/>
+          <w:i w:val="0"/>
+          <w:color w:val="000000"/>
+          <w:sz w:val="26"/>
+        </w:rPr>
+        <w:t>Chăm chỉ</w:t>
+      </w:r>
+    </w:p>
+    <w:p>
+      <w:pPr>
+        <w:spacing w:before="60" w:after="60" w:line="312" w:lineRule="auto"/>
+        <w:ind w:left="283" w:hanging="170"/>
+        <w:jc w:val="both"/>
+      </w:pPr>
+      <w:r>
+        <w:rPr>
+          <w:rFonts w:ascii="Times New Roman" w:hAnsi="Times New Roman"/>
+          <w:color w:val="000000"/>
+          <w:sz w:val="26"/>
+        </w:rPr>
+        <w:t xml:space="preserve">- </w:t>
+      </w:r>
+      <w:r>
+        <w:rPr>
+          <w:rFonts w:ascii="Times New Roman" w:hAnsi="Times New Roman"/>
+          <w:b w:val="0"/>
+          <w:i w:val="0"/>
+          <w:color w:val="000000"/>
+          <w:sz w:val="26"/>
+        </w:rPr>
+        <w:t>Trách nhiệm</w:t>
+      </w:r>
+    </w:p>
+    <w:p>
+      <w:pPr>
+        <w:keepNext/>
+        <w:spacing w:before="160" w:after="160"/>
+        <w:jc w:val="center"/>
+      </w:pPr>
+      <w:r>
+        <w:rPr>
+          <w:rFonts w:ascii="Times New Roman" w:hAnsi="Times New Roman"/>
+          <w:color w:val="BFBFBF"/>
+          <w:sz w:val="18"/>
+        </w:rPr>
+        <w:t>———————————————————————————————————</w:t>
+      </w:r>
+    </w:p>
+    <w:p>
+      <w:pPr>
+        <w:pStyle w:val="Heading1"/>
+        <w:keepNext/>
+        <w:spacing w:before="240" w:after="120"/>
+        <w:ind w:left="0" w:firstLine="0"/>
+        <w:jc w:val="both"/>
+      </w:pPr>
+      <w:r>
+        <w:rPr>
+          <w:rFonts w:ascii="Times New Roman" w:hAnsi="Times New Roman"/>
+          <w:b/>
+          <w:i w:val="0"/>
+          <w:color w:val="1F4E79"/>
+          <w:sz w:val="28"/>
+        </w:rPr>
+        <w:t>II. THIẾT BỊ DẠY HỌC VÀ HỌC LIỆU</w:t>
+      </w:r>
+    </w:p>
+    <w:p>
+      <w:pPr>
+        <w:pStyle w:val="Heading2"/>
+        <w:keepNext/>
+        <w:spacing w:before="160" w:after="80"/>
+        <w:ind w:left="0" w:firstLine="0"/>
+        <w:jc w:val="both"/>
+      </w:pPr>
+      <w:r>
+        <w:rPr>
+          <w:rFonts w:ascii="Times New Roman" w:hAnsi="Times New Roman"/>
+          <w:b/>
+          <w:i w:val="0"/>
+          <w:color w:val="000000"/>
+          <w:sz w:val="26"/>
+        </w:rPr>
+        <w:t>1. Giáo viên</w:t>
+      </w:r>
+    </w:p>
+    <w:p>
+      <w:pPr>
+        <w:spacing w:before="60" w:after="60" w:line="312" w:lineRule="auto"/>
+        <w:ind w:left="283" w:hanging="170"/>
+        <w:jc w:val="both"/>
+      </w:pPr>
+      <w:r>
+        <w:rPr>
+          <w:rFonts w:ascii="Times New Roman" w:hAnsi="Times New Roman"/>
+          <w:color w:val="000000"/>
+          <w:sz w:val="26"/>
+        </w:rPr>
+        <w:t xml:space="preserve">- </w:t>
+      </w:r>
+      <w:r>
+        <w:rPr>
+          <w:rFonts w:ascii="Times New Roman" w:hAnsi="Times New Roman"/>
+          <w:b w:val="0"/>
+          <w:i w:val="0"/>
+          <w:color w:val="000000"/>
+          <w:sz w:val="26"/>
+        </w:rPr>
+        <w:t>Máy chiếu</w:t>
+      </w:r>
+    </w:p>
+    <w:p>
+      <w:pPr>
+        <w:spacing w:before="60" w:after="60" w:line="312" w:lineRule="auto"/>
+        <w:ind w:left="283" w:hanging="170"/>
+        <w:jc w:val="both"/>
+      </w:pPr>
+      <w:r>
+        <w:rPr>
+          <w:rFonts w:ascii="Times New Roman" w:hAnsi="Times New Roman"/>
+          <w:color w:val="000000"/>
+          <w:sz w:val="26"/>
+        </w:rPr>
+        <w:t xml:space="preserve">- </w:t>
+      </w:r>
+      <w:r>
+        <w:rPr>
+          <w:rFonts w:ascii="Times New Roman" w:hAnsi="Times New Roman"/>
+          <w:b w:val="0"/>
+          <w:i w:val="0"/>
+          <w:color w:val="000000"/>
+          <w:sz w:val="26"/>
+        </w:rPr>
+        <w:t>Phiếu học tập</w:t>
+      </w:r>
+    </w:p>
+    <w:p>
+      <w:pPr>
+        <w:pStyle w:val="Heading2"/>
+        <w:keepNext/>
+        <w:spacing w:before="160" w:after="80"/>
+        <w:ind w:left="0" w:firstLine="0"/>
+        <w:jc w:val="both"/>
+      </w:pPr>
+      <w:r>
+        <w:rPr>
+          <w:rFonts w:ascii="Times New Roman" w:hAnsi="Times New Roman"/>
+          <w:b/>
+          <w:i w:val="0"/>
+          <w:color w:val="000000"/>
+          <w:sz w:val="26"/>
+        </w:rPr>
+        <w:t>2. Học sinh</w:t>
+      </w:r>
+    </w:p>
+    <w:p>
+      <w:pPr>
+        <w:spacing w:before="60" w:after="60" w:line="312" w:lineRule="auto"/>
+        <w:ind w:left="283" w:hanging="170"/>
+        <w:jc w:val="both"/>
+      </w:pPr>
+      <w:r>
+        <w:rPr>
+          <w:rFonts w:ascii="Times New Roman" w:hAnsi="Times New Roman"/>
+          <w:color w:val="000000"/>
+          <w:sz w:val="26"/>
+        </w:rPr>
+        <w:t xml:space="preserve">- </w:t>
+      </w:r>
+      <w:r>
+        <w:rPr>
+          <w:rFonts w:ascii="Times New Roman" w:hAnsi="Times New Roman"/>
+          <w:b w:val="0"/>
+          <w:i w:val="0"/>
+          <w:color w:val="000000"/>
+          <w:sz w:val="26"/>
+        </w:rPr>
+        <w:t>SGK</w:t>
+      </w:r>
+    </w:p>
+    <w:p>
+      <w:pPr>
+        <w:spacing w:before="60" w:after="60" w:line="312" w:lineRule="auto"/>
+        <w:ind w:left="283" w:hanging="170"/>
+        <w:jc w:val="both"/>
+      </w:pPr>
+      <w:r>
+        <w:rPr>
+          <w:rFonts w:ascii="Times New Roman" w:hAnsi="Times New Roman"/>
+          <w:color w:val="000000"/>
+          <w:sz w:val="26"/>
+        </w:rPr>
+        <w:t xml:space="preserve">- </w:t>
+      </w:r>
+      <w:r>
+        <w:rPr>
+          <w:rFonts w:ascii="Times New Roman" w:hAnsi="Times New Roman"/>
+          <w:b w:val="0"/>
+          <w:i w:val="0"/>
+          <w:color w:val="000000"/>
+          <w:sz w:val="26"/>
+        </w:rPr>
+        <w:t>Vở ghi</w:t>
+      </w:r>
+    </w:p>
+    <w:p>
+      <w:pPr>
+        <w:keepNext/>
+        <w:spacing w:before="160" w:after="160"/>
+        <w:jc w:val="center"/>
+      </w:pPr>
+      <w:r>
+        <w:rPr>
+          <w:rFonts w:ascii="Times New Roman" w:hAnsi="Times New Roman"/>
+          <w:color w:val="BFBFBF"/>
+          <w:sz w:val="18"/>
+        </w:rPr>
+        <w:t>———————————————————————————————————</w:t>
+      </w:r>
+    </w:p>
+    <w:p>
+      <w:pPr>
+        <w:pStyle w:val="Heading1"/>
+        <w:keepNext/>
+        <w:spacing w:before="240" w:after="120"/>
+        <w:ind w:left="0" w:firstLine="0"/>
+        <w:jc w:val="both"/>
+      </w:pPr>
+      <w:r>
+        <w:rPr>
+          <w:rFonts w:ascii="Times New Roman" w:hAnsi="Times New Roman"/>
+          <w:b/>
+          <w:i w:val="0"/>
+          <w:color w:val="1F4E79"/>
+          <w:sz w:val="28"/>
+        </w:rPr>
+        <w:t>III. TIẾN TRÌNH DẠY HỌC</w:t>
+      </w:r>
+    </w:p>
+    <w:p>
+      <w:pPr>
+        <w:pStyle w:val="Heading2"/>
+        <w:keepNext/>
+        <w:spacing w:before="160" w:after="80"/>
+        <w:ind w:left="0" w:firstLine="0"/>
+        <w:jc w:val="both"/>
+      </w:pPr>
+      <w:r>
+        <w:rPr>
+          <w:rFonts w:ascii="Times New Roman" w:hAnsi="Times New Roman"/>
+          <w:b/>
+          <w:i w:val="0"/>
+          <w:color w:val="000000"/>
+          <w:sz w:val="26"/>
+        </w:rPr>
+        <w:t>1. Hoạt động 1: Hoạt động 1: Đơn vị kiến thức 1 của Bài 4 - Nhiệt dung riêng</w:t>
+      </w:r>
+    </w:p>
+    <w:p>
+      <w:pPr>
+        <w:spacing w:before="120" w:after="120" w:line="312" w:lineRule="auto"/>
+        <w:ind w:left="0" w:firstLine="567"/>
+        <w:jc w:val="both"/>
+      </w:pPr>
+      <w:r>
+        <w:rPr>
+          <w:rFonts w:ascii="Times New Roman" w:hAnsi="Times New Roman"/>
+          <w:b w:val="0"/>
+          <w:i w:val="0"/>
+          <w:color w:val="000000"/>
+          <w:sz w:val="26"/>
+        </w:rPr>
+        <w:t>a) Mục tiêu: Mục tiêu hoạt động mẫu.</w:t>
+      </w:r>
+    </w:p>
+    <w:p>
+      <w:pPr>
+        <w:spacing w:before="120" w:after="120" w:line="312" w:lineRule="auto"/>
+        <w:ind w:left="0" w:firstLine="567"/>
+        <w:jc w:val="both"/>
+      </w:pPr>
+      <w:r>
+        <w:rPr>
+          <w:rFonts w:ascii="Times New Roman" w:hAnsi="Times New Roman"/>
+          <w:b w:val="0"/>
+          <w:i w:val="0"/>
+          <w:color w:val="000000"/>
+          <w:sz w:val="26"/>
+        </w:rPr>
+        <w:t>b) Nội dung: Nội dung hoạt động mẫu.</w:t>
+      </w:r>
+    </w:p>
+    <w:p>
+      <w:pPr>
+        <w:spacing w:before="120" w:after="120" w:line="312" w:lineRule="auto"/>
+        <w:ind w:left="0" w:firstLine="567"/>
+        <w:jc w:val="both"/>
+      </w:pPr>
+      <w:r>
+        <w:rPr>
+          <w:rFonts w:ascii="Times New Roman" w:hAnsi="Times New Roman"/>
+          <w:b w:val="0"/>
+          <w:i w:val="0"/>
+          <w:color w:val="000000"/>
+          <w:sz w:val="26"/>
+        </w:rPr>
+        <w:t>c) Sản phẩm: Sản phẩm học tập mẫu.</w:t>
+      </w:r>
+    </w:p>
+    <w:p>
+      <w:pPr>
+        <w:spacing w:before="120" w:after="120" w:line="312" w:lineRule="auto"/>
+        <w:ind w:left="0" w:firstLine="567"/>
+        <w:jc w:val="both"/>
+      </w:pPr>
+      <w:r>
+        <w:rPr>
+          <w:rFonts w:ascii="Times New Roman" w:hAnsi="Times New Roman"/>
+          <w:b/>
+          <w:i w:val="0"/>
+          <w:color w:val="000000"/>
+          <w:sz w:val="26"/>
+        </w:rPr>
+        <w:t>Kĩ thuật dạy học tích cực:</w:t>
+      </w:r>
+      <w:r>
+        <w:rPr>
+          <w:rFonts w:ascii="Times New Roman" w:hAnsi="Times New Roman"/>
+          <w:b w:val="0"/>
+          <w:i w:val="0"/>
+          <w:color w:val="000000"/>
+          <w:sz w:val="26"/>
+        </w:rPr>
+        <w:t xml:space="preserve"> Chia sẻ nhóm đôi</w:t>
+      </w:r>
+    </w:p>
+    <w:p>
+      <w:pPr>
+        <w:spacing w:before="120" w:after="120" w:line="312" w:lineRule="auto"/>
+        <w:ind w:left="0" w:firstLine="567"/>
+        <w:jc w:val="both"/>
+      </w:pPr>
+      <w:r>
+        <w:rPr>
+          <w:rFonts w:ascii="Times New Roman" w:hAnsi="Times New Roman"/>
+          <w:b/>
+          <w:i w:val="0"/>
+          <w:color w:val="000000"/>
+          <w:sz w:val="26"/>
+        </w:rPr>
+        <w:t>Năng lực số:</w:t>
+      </w:r>
+      <w:r>
+        <w:rPr>
+          <w:rFonts w:ascii="Times New Roman" w:hAnsi="Times New Roman"/>
+          <w:b w:val="0"/>
+          <w:i w:val="0"/>
+          <w:color w:val="000000"/>
+          <w:sz w:val="26"/>
+        </w:rPr>
+        <w:t xml:space="preserve"> 1.2</w:t>
+      </w:r>
+    </w:p>
+    <w:p>
+      <w:pPr>
+        <w:spacing w:before="120" w:after="120" w:line="312" w:lineRule="auto"/>
+        <w:ind w:left="0" w:firstLine="567"/>
+        <w:jc w:val="both"/>
+      </w:pPr>
+      <w:r>
+        <w:rPr>
+          <w:rFonts w:ascii="Times New Roman" w:hAnsi="Times New Roman"/>
+          <w:b w:val="0"/>
+          <w:i w:val="0"/>
+          <w:color w:val="000000"/>
+          <w:sz w:val="26"/>
+        </w:rPr>
+        <w:t>d) Tổ chức thực hiện:</w:t>
+      </w:r>
+    </w:p>
+    <w:tbl>
+      <w:tblPr>
+        <w:jc w:val="center"/>
+        <w:tblLayout w:type="fixed"/>
+        <w:tblLook w:firstColumn="1" w:firstRow="1" w:lastColumn="0" w:lastRow="0" w:noHBand="0" w:noVBand="1" w:val="04A0"/>
+        <w:tblW w:w="9072" w:type="dxa"/>
+      </w:tblPr>
+      <w:tblGrid>
+        <w:gridCol w:w="4535"/>
+        <w:gridCol w:w="4535"/>
+      </w:tblGrid>
+      <w:tr>
+        <w:trPr>
+          <w:cantSplit/>
+          <w:tblHeader/>
+        </w:trPr>
+        <w:tc>
+          <w:tcPr>
+            <w:tcW w:type="dxa" w:w="6236"/>
+            <w:shd w:fill="D9D9D9"/>
+            <w:tcMar>
+              <w:top w:w="114" w:type="dxa"/>
+              <w:bottom w:w="114" w:type="dxa"/>
+              <w:left w:w="170" w:type="dxa"/>
+              <w:right w:w="170" w:type="dxa"/>
+            </w:tcMar>
+            <w:tcBorders>
+              <w:top w:val="single" w:sz="4" w:space="0" w:color="BFBFBF"/>
+              <w:left w:val="single" w:sz="4" w:space="0" w:color="BFBFBF"/>
+              <w:bottom w:val="single" w:sz="4" w:space="0" w:color="BFBFBF"/>
+              <w:right w:val="single" w:sz="4" w:space="0" w:color="BFBFBF"/>
+            </w:tcBorders>
+          </w:tcPr>
+          <w:p>
+            <w:pPr>
+              <w:spacing w:before="40" w:after="40"/>
+              <w:jc w:val="center"/>
+            </w:pPr>
+            <w:r>
+              <w:rPr>
+                <w:rFonts w:ascii="Times New Roman" w:hAnsi="Times New Roman"/>
+                <w:b/>
+                <w:color w:val="000000"/>
+                <w:sz w:val="24"/>
+              </w:rPr>
+              <w:t>Hoạt động của giáo viên và học sinh</w:t>
+            </w:r>
+          </w:p>
+        </w:tc>
+        <w:tc>
+          <w:tcPr>
+            <w:tcW w:type="dxa" w:w="2835"/>
+            <w:shd w:fill="D9D9D9"/>
+            <w:tcMar>
+              <w:top w:w="114" w:type="dxa"/>
+              <w:bottom w:w="114" w:type="dxa"/>
+              <w:left w:w="170" w:type="dxa"/>
+              <w:right w:w="170" w:type="dxa"/>
+            </w:tcMar>
+            <w:tcBorders>
+              <w:top w:val="single" w:sz="4" w:space="0" w:color="BFBFBF"/>
+              <w:left w:val="single" w:sz="4" w:space="0" w:color="BFBFBF"/>
+              <w:bottom w:val="single" w:sz="4" w:space="0" w:color="BFBFBF"/>
+              <w:right w:val="single" w:sz="4" w:space="0" w:color="BFBFBF"/>
+            </w:tcBorders>
+          </w:tcPr>
+          <w:p>
+            <w:pPr>
+              <w:spacing w:before="40" w:after="40"/>
+              <w:jc w:val="center"/>
+            </w:pPr>
+            <w:r>
+              <w:rPr>
+                <w:rFonts w:ascii="Times New Roman" w:hAnsi="Times New Roman"/>
+                <w:b/>
+                <w:color w:val="000000"/>
+                <w:sz w:val="24"/>
+              </w:rPr>
+              <w:t>Sản phẩm</w:t>
+            </w:r>
+          </w:p>
+        </w:tc>
+      </w:tr>
+      <w:tr>
+        <w:trPr>
+          <w:cantSplit/>
+        </w:trPr>
+        <w:tc>
+          <w:tcPr>
+            <w:tcW w:type="dxa" w:w="6236"/>
+            <w:tcMar>
+              <w:top w:w="114" w:type="dxa"/>
+              <w:bottom w:w="114" w:type="dxa"/>
+              <w:left w:w="170" w:type="dxa"/>
+              <w:right w:w="170" w:type="dxa"/>
+            </w:tcMar>
+            <w:tcBorders>
+              <w:top w:val="single" w:sz="4" w:space="0" w:color="BFBFBF"/>
+              <w:left w:val="single" w:sz="4" w:space="0" w:color="BFBFBF"/>
+              <w:bottom w:val="single" w:sz="4" w:space="0" w:color="BFBFBF"/>
+              <w:right w:val="single" w:sz="4" w:space="0" w:color="BFBFBF"/>
+            </w:tcBorders>
+          </w:tcPr>
+          <w:p>
+            <w:pPr>
+              <w:spacing w:before="40" w:after="40" w:line="276" w:lineRule="auto"/>
+              <w:jc w:val="left"/>
+            </w:pPr>
+            <w:r>
+              <w:rPr>
+                <w:rFonts w:ascii="Times New Roman" w:hAnsi="Times New Roman"/>
+                <w:b/>
+                <w:i w:val="0"/>
+                <w:color w:val="1F4E79"/>
+                <w:sz w:val="22"/>
+              </w:rPr>
+              <w:t>Bước 1: Chuyển giao nhiệm vụ:</w:t>
+            </w:r>
+          </w:p>
+          <w:p>
+            <w:pPr>
+              <w:spacing w:before="40" w:after="40" w:line="276" w:lineRule="auto"/>
+              <w:jc w:val="left"/>
+            </w:pPr>
+            <w:r>
+              <w:rPr>
+                <w:rFonts w:ascii="Times New Roman" w:hAnsi="Times New Roman"/>
+                <w:b w:val="0"/>
+                <w:i w:val="0"/>
+                <w:color w:val="000000"/>
+                <w:sz w:val="22"/>
+              </w:rPr>
+              <w:t>Giáo viên giao nhiệm vụ mẫu.</w:t>
+            </w:r>
+          </w:p>
+          <w:p>
+            <w:pPr>
+              <w:spacing w:before="40" w:after="40" w:line="276" w:lineRule="auto"/>
+              <w:jc w:val="left"/>
+            </w:pPr>
+            <w:r>
+              <w:rPr>
+                <w:rFonts w:ascii="Times New Roman" w:hAnsi="Times New Roman"/>
+                <w:b/>
+                <w:i w:val="0"/>
+                <w:color w:val="1F4E79"/>
+                <w:sz w:val="22"/>
+              </w:rPr>
+              <w:t>Bước 2: Thực hiện nhiệm vụ:</w:t>
+            </w:r>
+          </w:p>
+          <w:p>
+            <w:pPr>
+              <w:spacing w:before="40" w:after="40" w:line="276" w:lineRule="auto"/>
+              <w:jc w:val="left"/>
+            </w:pPr>
+            <w:r>
+              <w:rPr>
+                <w:rFonts w:ascii="Times New Roman" w:hAnsi="Times New Roman"/>
+                <w:b w:val="0"/>
+                <w:i w:val="0"/>
+                <w:color w:val="000000"/>
+                <w:sz w:val="22"/>
+              </w:rPr>
+              <w:t>Học sinh thực hiện nhiệm vụ mẫu.</w:t>
+            </w:r>
+          </w:p>
+          <w:p>
+            <w:pPr>
+              <w:spacing w:before="40" w:after="40" w:line="276" w:lineRule="auto"/>
+              <w:jc w:val="left"/>
+            </w:pPr>
+            <w:r>
+              <w:rPr>
+                <w:rFonts w:ascii="Times New Roman" w:hAnsi="Times New Roman"/>
+                <w:b/>
+                <w:i w:val="0"/>
+                <w:color w:val="1F4E79"/>
+                <w:sz w:val="22"/>
+              </w:rPr>
+              <w:t>Bước 3: Báo cáo, thảo luận:</w:t>
+            </w:r>
+          </w:p>
+          <w:p>
+            <w:pPr>
+              <w:spacing w:before="40" w:after="40" w:line="276" w:lineRule="auto"/>
+              <w:jc w:val="left"/>
+            </w:pPr>
+            <w:r>
+              <w:rPr>
+                <w:rFonts w:ascii="Times New Roman" w:hAnsi="Times New Roman"/>
+                <w:b w:val="0"/>
+                <w:i w:val="0"/>
+                <w:color w:val="000000"/>
+                <w:sz w:val="22"/>
+              </w:rPr>
+              <w:t>Học sinh báo cáo kết quả mẫu.</w:t>
+            </w:r>
+          </w:p>
+          <w:p>
+            <w:pPr>
+              <w:spacing w:before="40" w:after="40" w:line="276" w:lineRule="auto"/>
+              <w:jc w:val="left"/>
+            </w:pPr>
+            <w:r>
+              <w:rPr>
+                <w:rFonts w:ascii="Times New Roman" w:hAnsi="Times New Roman"/>
+                <w:b/>
+                <w:i w:val="0"/>
+                <w:color w:val="1F4E79"/>
+                <w:sz w:val="22"/>
+              </w:rPr>
+              <w:t>Bước 4: Kết luận, nhận định:</w:t>
+            </w:r>
+          </w:p>
+          <w:p>
+            <w:pPr>
+              <w:spacing w:before="40" w:after="40" w:line="276" w:lineRule="auto"/>
+              <w:jc w:val="left"/>
+            </w:pPr>
+            <w:r>
+              <w:rPr>
+                <w:rFonts w:ascii="Times New Roman" w:hAnsi="Times New Roman"/>
+                <w:b w:val="0"/>
+                <w:i w:val="0"/>
+                <w:color w:val="000000"/>
+                <w:sz w:val="22"/>
+              </w:rPr>
+              <w:t>Giáo viên kết luận, chuẩn hóa kiến thức mẫu.</w:t>
+            </w:r>
+          </w:p>
+        </w:tc>
+        <w:tc>
+          <w:tcPr>
+            <w:tcW w:type="dxa" w:w="2835"/>
+            <w:tcMar>
+              <w:top w:w="114" w:type="dxa"/>
+              <w:bottom w:w="114" w:type="dxa"/>
+              <w:left w:w="170" w:type="dxa"/>
+              <w:right w:w="170" w:type="dxa"/>
+            </w:tcMar>
+            <w:tcBorders>
+              <w:top w:val="single" w:sz="4" w:space="0" w:color="BFBFBF"/>
+              <w:left w:val="single" w:sz="4" w:space="0" w:color="BFBFBF"/>
+              <w:bottom w:val="single" w:sz="4" w:space="0" w:color="BFBFBF"/>
+              <w:right w:val="single" w:sz="4" w:space="0" w:color="BFBFBF"/>
+            </w:tcBorders>
+          </w:tcPr>
+          <w:p>
+            <w:pPr>
+              <w:spacing w:before="40" w:after="40" w:line="276" w:lineRule="auto"/>
+              <w:jc w:val="left"/>
+            </w:pPr>
+            <w:r>
+              <w:rPr>
+                <w:rFonts w:ascii="Times New Roman" w:hAnsi="Times New Roman"/>
+                <w:b w:val="0"/>
+                <w:i w:val="0"/>
+                <w:color w:val="000000"/>
+                <w:sz w:val="22"/>
+              </w:rPr>
+              <w:t>Sản phẩm học tập mẫu.</w:t>
+            </w:r>
+          </w:p>
+        </w:tc>
+      </w:tr>
+    </w:tbl>
+    <w:p/>
+    <w:p>
+      <w:pPr>
+        <w:keepNext/>
+        <w:spacing w:before="160" w:after="160"/>
+        <w:jc w:val="center"/>
+      </w:pPr>
+      <w:r>
+        <w:rPr>
+          <w:rFonts w:ascii="Times New Roman" w:hAnsi="Times New Roman"/>
+          <w:color w:val="BFBFBF"/>
+          <w:sz w:val="18"/>
+        </w:rPr>
+        <w:t>———————————————————————————————————</w:t>
+      </w:r>
+    </w:p>
+    <w:p>
+      <w:pPr>
+        <w:pStyle w:val="Heading2"/>
+        <w:keepNext/>
+        <w:spacing w:before="160" w:after="80"/>
+        <w:ind w:left="0" w:firstLine="0"/>
+        <w:jc w:val="both"/>
+      </w:pPr>
+      <w:r>
+        <w:rPr>
+          <w:rFonts w:ascii="Times New Roman" w:hAnsi="Times New Roman"/>
+          <w:b/>
+          <w:i w:val="0"/>
+          <w:color w:val="000000"/>
+          <w:sz w:val="26"/>
+        </w:rPr>
+        <w:t>2. Hoạt động 2: Hoạt động 2: Đơn vị kiến thức 2 của Bài 4 - Nhiệt dung riêng</w:t>
+      </w:r>
+    </w:p>
+    <w:p>
+      <w:pPr>
+        <w:spacing w:before="120" w:after="120" w:line="312" w:lineRule="auto"/>
+        <w:ind w:left="0" w:firstLine="567"/>
+        <w:jc w:val="both"/>
+      </w:pPr>
+      <w:r>
+        <w:rPr>
+          <w:rFonts w:ascii="Times New Roman" w:hAnsi="Times New Roman"/>
+          <w:b w:val="0"/>
+          <w:i w:val="0"/>
+          <w:color w:val="000000"/>
+          <w:sz w:val="26"/>
+        </w:rPr>
+        <w:t>a) Mục tiêu: Mục tiêu hoạt động mẫu.</w:t>
+      </w:r>
+    </w:p>
+    <w:p>
+      <w:pPr>
+        <w:spacing w:before="120" w:after="120" w:line="312" w:lineRule="auto"/>
+        <w:ind w:left="0" w:firstLine="567"/>
+        <w:jc w:val="both"/>
+      </w:pPr>
+      <w:r>
+        <w:rPr>
+          <w:rFonts w:ascii="Times New Roman" w:hAnsi="Times New Roman"/>
+          <w:b w:val="0"/>
+          <w:i w:val="0"/>
+          <w:color w:val="000000"/>
+          <w:sz w:val="26"/>
+        </w:rPr>
+        <w:t>b) Nội dung: Nội dung hoạt động mẫu.</w:t>
+      </w:r>
+    </w:p>
+    <w:p>
+      <w:pPr>
+        <w:spacing w:before="120" w:after="120" w:line="312" w:lineRule="auto"/>
+        <w:ind w:left="0" w:firstLine="567"/>
+        <w:jc w:val="both"/>
+      </w:pPr>
+      <w:r>
+        <w:rPr>
+          <w:rFonts w:ascii="Times New Roman" w:hAnsi="Times New Roman"/>
+          <w:b w:val="0"/>
+          <w:i w:val="0"/>
+          <w:color w:val="000000"/>
+          <w:sz w:val="26"/>
+        </w:rPr>
+        <w:t>c) Sản phẩm: Sản phẩm học tập mẫu.</w:t>
+      </w:r>
+    </w:p>
+    <w:p>
+      <w:pPr>
+        <w:spacing w:before="120" w:after="120" w:line="312" w:lineRule="auto"/>
+        <w:ind w:left="0" w:firstLine="567"/>
+        <w:jc w:val="both"/>
+      </w:pPr>
+      <w:r>
+        <w:rPr>
+          <w:rFonts w:ascii="Times New Roman" w:hAnsi="Times New Roman"/>
+          <w:b/>
+          <w:i w:val="0"/>
+          <w:color w:val="000000"/>
+          <w:sz w:val="26"/>
+        </w:rPr>
+        <w:t>Kĩ thuật dạy học tích cực:</w:t>
+      </w:r>
+      <w:r>
+        <w:rPr>
+          <w:rFonts w:ascii="Times New Roman" w:hAnsi="Times New Roman"/>
+          <w:b w:val="0"/>
+          <w:i w:val="0"/>
+          <w:color w:val="000000"/>
+          <w:sz w:val="26"/>
+        </w:rPr>
+        <w:t xml:space="preserve"> Chia sẻ nhóm đôi</w:t>
+      </w:r>
+    </w:p>
+    <w:p>
+      <w:pPr>
+        <w:spacing w:before="120" w:after="120" w:line="312" w:lineRule="auto"/>
+        <w:ind w:left="0" w:firstLine="567"/>
+        <w:jc w:val="both"/>
+      </w:pPr>
+      <w:r>
+        <w:rPr>
+          <w:rFonts w:ascii="Times New Roman" w:hAnsi="Times New Roman"/>
+          <w:b/>
+          <w:i w:val="0"/>
+          <w:color w:val="000000"/>
+          <w:sz w:val="26"/>
+        </w:rPr>
+        <w:t>Năng lực số:</w:t>
+      </w:r>
+      <w:r>
+        <w:rPr>
+          <w:rFonts w:ascii="Times New Roman" w:hAnsi="Times New Roman"/>
+          <w:b w:val="0"/>
+          <w:i w:val="0"/>
+          <w:color w:val="000000"/>
+          <w:sz w:val="26"/>
+        </w:rPr>
+        <w:t xml:space="preserve"> 1.2</w:t>
+      </w:r>
+    </w:p>
+    <w:p>
+      <w:pPr>
+        <w:spacing w:before="120" w:after="120" w:line="312" w:lineRule="auto"/>
+        <w:ind w:left="0" w:firstLine="567"/>
+        <w:jc w:val="both"/>
+      </w:pPr>
+      <w:r>
+        <w:rPr>
+          <w:rFonts w:ascii="Times New Roman" w:hAnsi="Times New Roman"/>
+          <w:b w:val="0"/>
+          <w:i w:val="0"/>
+          <w:color w:val="000000"/>
+          <w:sz w:val="26"/>
+        </w:rPr>
+        <w:t>d) Tổ chức thực hiện:</w:t>
+      </w:r>
+    </w:p>
+    <w:tbl>
+      <w:tblPr>
+        <w:jc w:val="center"/>
+        <w:tblLayout w:type="fixed"/>
+        <w:tblLook w:firstColumn="1" w:firstRow="1" w:lastColumn="0" w:lastRow="0" w:noHBand="0" w:noVBand="1" w:val="04A0"/>
+        <w:tblW w:w="9072" w:type="dxa"/>
+      </w:tblPr>
+      <w:tblGrid>
+        <w:gridCol w:w="4535"/>
+        <w:gridCol w:w="4535"/>
+      </w:tblGrid>
+      <w:tr>
+        <w:trPr>
+          <w:cantSplit/>
+          <w:tblHeader/>
+        </w:trPr>
+        <w:tc>
+          <w:tcPr>
+            <w:tcW w:type="dxa" w:w="6236"/>
+            <w:shd w:fill="D9D9D9"/>
+            <w:tcMar>
+              <w:top w:w="114" w:type="dxa"/>
+              <w:bottom w:w="114" w:type="dxa"/>
+              <w:left w:w="170" w:type="dxa"/>
+              <w:right w:w="170" w:type="dxa"/>
+            </w:tcMar>
+            <w:tcBorders>
+              <w:top w:val="single" w:sz="4" w:space="0" w:color="BFBFBF"/>
+              <w:left w:val="single" w:sz="4" w:space="0" w:color="BFBFBF"/>
+              <w:bottom w:val="single" w:sz="4" w:space="0" w:color="BFBFBF"/>
+              <w:right w:val="single" w:sz="4" w:space="0" w:color="BFBFBF"/>
+            </w:tcBorders>
+          </w:tcPr>
+          <w:p>
+            <w:pPr>
+              <w:spacing w:before="40" w:after="40"/>
+              <w:jc w:val="center"/>
+            </w:pPr>
+            <w:r>
+              <w:rPr>
+                <w:rFonts w:ascii="Times New Roman" w:hAnsi="Times New Roman"/>
+                <w:b/>
+                <w:color w:val="000000"/>
+                <w:sz w:val="24"/>
+              </w:rPr>
+              <w:t>Hoạt động của giáo viên và học sinh</w:t>
+            </w:r>
+          </w:p>
+        </w:tc>
+        <w:tc>
+          <w:tcPr>
+            <w:tcW w:type="dxa" w:w="2835"/>
+            <w:shd w:fill="D9D9D9"/>
+            <w:tcMar>
+              <w:top w:w="114" w:type="dxa"/>
+              <w:bottom w:w="114" w:type="dxa"/>
+              <w:left w:w="170" w:type="dxa"/>
+              <w:right w:w="170" w:type="dxa"/>
+            </w:tcMar>
+            <w:tcBorders>
+              <w:top w:val="single" w:sz="4" w:space="0" w:color="BFBFBF"/>
+              <w:left w:val="single" w:sz="4" w:space="0" w:color="BFBFBF"/>
+              <w:bottom w:val="single" w:sz="4" w:space="0" w:color="BFBFBF"/>
+              <w:right w:val="single" w:sz="4" w:space="0" w:color="BFBFBF"/>
+            </w:tcBorders>
+          </w:tcPr>
+          <w:p>
+            <w:pPr>
+              <w:spacing w:before="40" w:after="40"/>
+              <w:jc w:val="center"/>
+            </w:pPr>
+            <w:r>
+              <w:rPr>
+                <w:rFonts w:ascii="Times New Roman" w:hAnsi="Times New Roman"/>
+                <w:b/>
+                <w:color w:val="000000"/>
+                <w:sz w:val="24"/>
+              </w:rPr>
+              <w:t>Sản phẩm</w:t>
+            </w:r>
+          </w:p>
+        </w:tc>
+      </w:tr>
+      <w:tr>
+        <w:trPr>
+          <w:cantSplit/>
+        </w:trPr>
+        <w:tc>
+          <w:tcPr>
+            <w:tcW w:type="dxa" w:w="6236"/>
+            <w:tcMar>
+              <w:top w:w="114" w:type="dxa"/>
+              <w:bottom w:w="114" w:type="dxa"/>
+              <w:left w:w="170" w:type="dxa"/>
+              <w:right w:w="170" w:type="dxa"/>
+            </w:tcMar>
+            <w:tcBorders>
+              <w:top w:val="single" w:sz="4" w:space="0" w:color="BFBFBF"/>
+              <w:left w:val="single" w:sz="4" w:space="0" w:color="BFBFBF"/>
+              <w:bottom w:val="single" w:sz="4" w:space="0" w:color="BFBFBF"/>
+              <w:right w:val="single" w:sz="4" w:space="0" w:color="BFBFBF"/>
+            </w:tcBorders>
+          </w:tcPr>
+          <w:p>
+            <w:pPr>
+              <w:spacing w:before="40" w:after="40" w:line="276" w:lineRule="auto"/>
+              <w:jc w:val="left"/>
+            </w:pPr>
+            <w:r>
+              <w:rPr>
+                <w:rFonts w:ascii="Times New Roman" w:hAnsi="Times New Roman"/>
+                <w:b/>
+                <w:i w:val="0"/>
+                <w:color w:val="1F4E79"/>
+                <w:sz w:val="22"/>
+              </w:rPr>
+              <w:t>Bước 1: Chuyển giao nhiệm vụ:</w:t>
+            </w:r>
+          </w:p>
+          <w:p>
+            <w:pPr>
+              <w:spacing w:before="40" w:after="40" w:line="276" w:lineRule="auto"/>
+              <w:jc w:val="left"/>
+            </w:pPr>
+            <w:r>
+              <w:rPr>
+                <w:rFonts w:ascii="Times New Roman" w:hAnsi="Times New Roman"/>
+                <w:b w:val="0"/>
+                <w:i w:val="0"/>
+                <w:color w:val="000000"/>
+                <w:sz w:val="22"/>
+              </w:rPr>
+              <w:t>Giáo viên giao nhiệm vụ mẫu.</w:t>
+            </w:r>
+          </w:p>
+          <w:p>
+            <w:pPr>
+              <w:spacing w:before="40" w:after="40" w:line="276" w:lineRule="auto"/>
+              <w:jc w:val="left"/>
+            </w:pPr>
+            <w:r>
+              <w:rPr>
+                <w:rFonts w:ascii="Times New Roman" w:hAnsi="Times New Roman"/>
+                <w:b/>
+                <w:i w:val="0"/>
+                <w:color w:val="1F4E79"/>
+                <w:sz w:val="22"/>
+              </w:rPr>
+              <w:t>Bước 2: Thực hiện nhiệm vụ:</w:t>
+            </w:r>
+          </w:p>
+          <w:p>
+            <w:pPr>
+              <w:spacing w:before="40" w:after="40" w:line="276" w:lineRule="auto"/>
+              <w:jc w:val="left"/>
+            </w:pPr>
+            <w:r>
+              <w:rPr>
+                <w:rFonts w:ascii="Times New Roman" w:hAnsi="Times New Roman"/>
+                <w:b w:val="0"/>
+                <w:i w:val="0"/>
+                <w:color w:val="000000"/>
+                <w:sz w:val="22"/>
+              </w:rPr>
+              <w:t>Học sinh thực hiện nhiệm vụ mẫu.</w:t>
+            </w:r>
+          </w:p>
+          <w:p>
+            <w:pPr>
+              <w:spacing w:before="40" w:after="40" w:line="276" w:lineRule="auto"/>
+              <w:jc w:val="left"/>
+            </w:pPr>
+            <w:r>
+              <w:rPr>
+                <w:rFonts w:ascii="Times New Roman" w:hAnsi="Times New Roman"/>
+                <w:b/>
+                <w:i w:val="0"/>
+                <w:color w:val="1F4E79"/>
+                <w:sz w:val="22"/>
+              </w:rPr>
+              <w:t>Bước 3: Báo cáo, thảo luận:</w:t>
+            </w:r>
+          </w:p>
+          <w:p>
+            <w:pPr>
+              <w:spacing w:before="40" w:after="40" w:line="276" w:lineRule="auto"/>
+              <w:jc w:val="left"/>
+            </w:pPr>
+            <w:r>
+              <w:rPr>
+                <w:rFonts w:ascii="Times New Roman" w:hAnsi="Times New Roman"/>
+                <w:b w:val="0"/>
+                <w:i w:val="0"/>
+                <w:color w:val="000000"/>
+                <w:sz w:val="22"/>
+              </w:rPr>
+              <w:t>Học sinh báo cáo kết quả mẫu.</w:t>
+            </w:r>
+          </w:p>
+          <w:p>
+            <w:pPr>
+              <w:spacing w:before="40" w:after="40" w:line="276" w:lineRule="auto"/>
+              <w:jc w:val="left"/>
+            </w:pPr>
+            <w:r>
+              <w:rPr>
+                <w:rFonts w:ascii="Times New Roman" w:hAnsi="Times New Roman"/>
+                <w:b/>
+                <w:i w:val="0"/>
+                <w:color w:val="1F4E79"/>
+                <w:sz w:val="22"/>
+              </w:rPr>
+              <w:t>Bước 4: Kết luận, nhận định:</w:t>
+            </w:r>
+          </w:p>
+          <w:p>
+            <w:pPr>
+              <w:spacing w:before="40" w:after="40" w:line="276" w:lineRule="auto"/>
+              <w:jc w:val="left"/>
+            </w:pPr>
+            <w:r>
+              <w:rPr>
+                <w:rFonts w:ascii="Times New Roman" w:hAnsi="Times New Roman"/>
+                <w:b w:val="0"/>
+                <w:i w:val="0"/>
+                <w:color w:val="000000"/>
+                <w:sz w:val="22"/>
+              </w:rPr>
+              <w:t>Giáo viên kết luận, chuẩn hóa kiến thức mẫu.</w:t>
+            </w:r>
+          </w:p>
+        </w:tc>
+        <w:tc>
+          <w:tcPr>
+            <w:tcW w:type="dxa" w:w="2835"/>
+            <w:tcMar>
+              <w:top w:w="114" w:type="dxa"/>
+              <w:bottom w:w="114" w:type="dxa"/>
+              <w:left w:w="170" w:type="dxa"/>
+              <w:right w:w="170" w:type="dxa"/>
+            </w:tcMar>
+            <w:tcBorders>
+              <w:top w:val="single" w:sz="4" w:space="0" w:color="BFBFBF"/>
+              <w:left w:val="single" w:sz="4" w:space="0" w:color="BFBFBF"/>
+              <w:bottom w:val="single" w:sz="4" w:space="0" w:color="BFBFBF"/>
+              <w:right w:val="single" w:sz="4" w:space="0" w:color="BFBFBF"/>
+            </w:tcBorders>
+          </w:tcPr>
+          <w:p>
+            <w:pPr>
+              <w:spacing w:before="40" w:after="40" w:line="276" w:lineRule="auto"/>
+              <w:jc w:val="left"/>
+            </w:pPr>
+            <w:r>
+              <w:rPr>
+                <w:rFonts w:ascii="Times New Roman" w:hAnsi="Times New Roman"/>
+                <w:b w:val="0"/>
+                <w:i w:val="0"/>
+                <w:color w:val="000000"/>
+                <w:sz w:val="22"/>
+              </w:rPr>
+              <w:t>Sản phẩm học tập mẫu.</w:t>
+            </w:r>
+          </w:p>
+        </w:tc>
+      </w:tr>
+    </w:tbl>
+    <w:p/>
+    <w:p>
+      <w:pPr>
+        <w:keepNext/>
+        <w:spacing w:before="160" w:after="160"/>
+        <w:jc w:val="center"/>
+      </w:pPr>
+      <w:r>
+        <w:rPr>
+          <w:rFonts w:ascii="Times New Roman" w:hAnsi="Times New Roman"/>
+          <w:color w:val="BFBFBF"/>
+          <w:sz w:val="18"/>
+        </w:rPr>
+        <w:t>———————————————————————————————————</w:t>
+      </w:r>
+    </w:p>
+    <w:p>
+      <w:pPr>
+        <w:pStyle w:val="Heading1"/>
+        <w:keepNext/>
+        <w:spacing w:before="240" w:after="120"/>
+        <w:ind w:left="0" w:firstLine="0"/>
+        <w:jc w:val="both"/>
+      </w:pPr>
+      <w:r>
+        <w:rPr>
+          <w:rFonts w:ascii="Times New Roman" w:hAnsi="Times New Roman"/>
+          <w:b/>
+          <w:i w:val="0"/>
+          <w:color w:val="1F4E79"/>
+          <w:sz w:val="28"/>
+        </w:rPr>
+        <w:t>IV. ĐIỀU CHỈNH BÀI DẠY SAU TIẾT GIẢNG</w:t>
+      </w:r>
+    </w:p>
+    <w:p>
+      <w:pPr>
+        <w:spacing w:before="80" w:after="80" w:line="312" w:lineRule="auto"/>
+        <w:jc w:val="left"/>
+      </w:pPr>
+      <w:r>
+        <w:rPr>
+          <w:rFonts w:ascii="Times New Roman" w:hAnsi="Times New Roman"/>
+          <w:b/>
+          <w:sz w:val="26"/>
+        </w:rPr>
+        <w:t>1. Ưu điểm nổi bật:</w:t>
+        <w:br/>
+      </w:r>
+      <w:r>
+        <w:rPr>
+          <w:rFonts w:ascii="Times New Roman" w:hAnsi="Times New Roman"/>
+          <w:sz w:val="26"/>
+        </w:rPr>
+        <w:t>1. **Ưu điểm:**</w:t>
+        <w:br/>
+      </w:r>
+      <w:r>
+        <w:rPr>
+          <w:rFonts w:ascii="Times New Roman" w:hAnsi="Times New Roman"/>
+          <w:color w:val="666666"/>
+          <w:sz w:val="26"/>
+        </w:rPr>
+        <w:t xml:space="preserve">   ........................................................................................................................</w:t>
+        <w:br/>
+      </w:r>
+      <w:r>
+        <w:rPr>
+          <w:rFonts w:ascii="Times New Roman" w:hAnsi="Times New Roman"/>
+          <w:b/>
+          <w:sz w:val="26"/>
+        </w:rPr>
+        <w:t>2. Hạn chế, khó khăn:</w:t>
+        <w:br/>
+      </w:r>
+      <w:r>
+        <w:rPr>
+          <w:rFonts w:ascii="Times New Roman" w:hAnsi="Times New Roman"/>
+          <w:sz w:val="26"/>
+        </w:rPr>
+        <w:t>2. **Hạn chế:**</w:t>
+        <w:br/>
+      </w:r>
+      <w:r>
+        <w:rPr>
+          <w:rFonts w:ascii="Times New Roman" w:hAnsi="Times New Roman"/>
+          <w:color w:val="666666"/>
+          <w:sz w:val="26"/>
+        </w:rPr>
+        <w:t xml:space="preserve">   ........................................................................................................................</w:t>
+        <w:br/>
+      </w:r>
+      <w:r>
+        <w:rPr>
+          <w:rFonts w:ascii="Times New Roman" w:hAnsi="Times New Roman"/>
+          <w:b/>
+          <w:sz w:val="26"/>
+        </w:rPr>
+        <w:t>3. Hướng điều chỉnh sư phạm:</w:t>
+        <w:br/>
+      </w:r>
+      <w:r>
+        <w:rPr>
+          <w:rFonts w:ascii="Times New Roman" w:hAnsi="Times New Roman"/>
+          <w:sz w:val="26"/>
+        </w:rPr>
+        <w:t>3. **Hướng điều chỉnh:**</w:t>
+        <w:br/>
+      </w:r>
+      <w:r>
+        <w:rPr>
+          <w:rFonts w:ascii="Times New Roman" w:hAnsi="Times New Roman"/>
+          <w:color w:val="666666"/>
+          <w:sz w:val="26"/>
+        </w:rPr>
+        <w:t xml:space="preserve">   ........................................................................................................................</w:t>
+        <w:br/>
+      </w:r>
+    </w:p>
+    <w:p>
+      <w:pPr>
+        <w:spacing w:before="280"/>
+        <w:ind w:right="567"/>
+        <w:jc w:val="right"/>
+      </w:pPr>
+      <w:r>
+        <w:rPr>
+          <w:rFonts w:ascii="Times New Roman" w:hAnsi="Times New Roman"/>
+          <w:i/>
+          <w:color w:val="000000"/>
+          <w:sz w:val="22"/>
+        </w:rPr>
+        <w:t>........., ngày ....... tháng ....... năm 202...</w:t>
+      </w:r>
+    </w:p>
+    <w:tbl>
+      <w:tblPr>
+        <w:jc w:val="center"/>
+        <w:tblLook w:firstColumn="1" w:firstRow="1" w:lastColumn="0" w:lastRow="0" w:noHBand="0" w:noVBand="1" w:val="04A0"/>
+        <w:tblW w:w="9072" w:type="dxa"/>
+      </w:tblPr>
+      <w:tblGrid>
+        <w:gridCol w:w="3024"/>
+        <w:gridCol w:w="3024"/>
+        <w:gridCol w:w="3024"/>
+      </w:tblGrid>
+      <w:tr>
+        <w:trPr>
+          <w:cantSplit/>
+        </w:trPr>
+        <w:tc>
+          <w:tcPr>
+            <w:tcW w:type="dxa" w:w="3005"/>
             <w:tcBorders>
               <w:top w:val="none"/>
               <w:left w:val="none"/>
@@ -26,40 +1918,25 @@
           </w:tcPr>
           <w:p>
             <w:pPr>
+              <w:spacing w:before="80" w:after="80"/>
               <w:jc w:val="center"/>
             </w:pPr>
             <w:r>
               <w:rPr>
                 <w:rFonts w:ascii="Times New Roman" w:hAnsi="Times New Roman"/>
-                <w:color w:val="212121"/>
+                <w:b/>
+                <w:color w:val="000000"/>
                 <w:sz w:val="22"/>
               </w:rPr>
-              <w:t>SỞ GIÁO DỤC VÀ ĐÀO TẠO</w:t>
+              <w:t>XÁC NHẬN CỦA BAN GIÁM HIỆU</w:t>
               <w:br/>
-            </w:r>
-            <w:r>
-              <w:rPr>
-                <w:rFonts w:ascii="Times New Roman" w:hAnsi="Times New Roman"/>
-                <w:b/>
-                <w:color w:val="212121"/>
-                <w:sz w:val="22"/>
-              </w:rPr>
-              <w:t>TRƯỜNG THPT: ................................</w:t>
-              <w:br/>
-            </w:r>
-            <w:r>
-              <w:rPr>
-                <w:rFonts w:ascii="Times New Roman" w:hAnsi="Times New Roman"/>
-                <w:color w:val="595959"/>
-                <w:sz w:val="18"/>
-              </w:rPr>
-              <w:t xml:space="preserve">   -----------------   </w:t>
+              <w:t>(Ký, đóng dấu)</w:t>
             </w:r>
           </w:p>
         </w:tc>
         <w:tc>
           <w:tcPr>
-            <w:tcW w:type="dxa" w:w="4677"/>
+            <w:tcW w:type="dxa" w:w="3005"/>
             <w:tcBorders>
               <w:top w:val="none"/>
               <w:left w:val="none"/>
@@ -69,1270 +1946,25 @@
           </w:tcPr>
           <w:p>
             <w:pPr>
+              <w:spacing w:before="80" w:after="80"/>
               <w:jc w:val="center"/>
             </w:pPr>
             <w:r>
               <w:rPr>
                 <w:rFonts w:ascii="Times New Roman" w:hAnsi="Times New Roman"/>
                 <w:b/>
-                <w:color w:val="212121"/>
+                <w:color w:val="000000"/>
                 <w:sz w:val="22"/>
               </w:rPr>
-              <w:t>CỘNG HÒA XÃ HỘI CHỦ NGHĨA VIỆT NAM</w:t>
+              <w:t>XÁC NHẬN CỦA TỔ TRƯỞNG</w:t>
               <w:br/>
-            </w:r>
-            <w:r>
-              <w:rPr>
-                <w:rFonts w:ascii="Times New Roman" w:hAnsi="Times New Roman"/>
-                <w:b/>
-                <w:color w:val="212121"/>
-                <w:sz w:val="22"/>
-              </w:rPr>
-              <w:t>Độc lập - Tự do - Hạnh phúc</w:t>
-              <w:br/>
-            </w:r>
-            <w:r>
-              <w:rPr>
-                <w:rFonts w:ascii="Times New Roman" w:hAnsi="Times New Roman"/>
-                <w:color w:val="212121"/>
-                <w:sz w:val="18"/>
-              </w:rPr>
-              <w:t xml:space="preserve">   _____________________   </w:t>
-            </w:r>
-          </w:p>
-        </w:tc>
-      </w:tr>
-    </w:tbl>
-    <w:p>
-      <w:pPr>
-        <w:spacing w:before="240"/>
-      </w:pPr>
-    </w:p>
-    <w:p>
-      <w:pPr>
-        <w:spacing w:after="240"/>
-        <w:jc w:val="center"/>
-      </w:pPr>
-      <w:r>
-        <w:rPr>
-          <w:rFonts w:ascii="Times New Roman" w:hAnsi="Times New Roman"/>
-          <w:b/>
-          <w:color w:val="1E3A5F"/>
-          <w:sz w:val="32"/>
-        </w:rPr>
-        <w:t>KẾ HOẠCH BÀI DẠY: BÀI 4 - NHIỆT DUNG RIÊNG</w:t>
-      </w:r>
-    </w:p>
-    <w:tbl>
-      <w:tblPr>
-        <w:tblW w:type="auto" w:w="0"/>
-        <w:jc w:val="center"/>
-        <w:tblLook w:firstColumn="1" w:firstRow="1" w:lastColumn="0" w:lastRow="0" w:noHBand="0" w:noVBand="1" w:val="04A0"/>
-      </w:tblPr>
-      <w:tblGrid>
-        <w:gridCol w:w="4677"/>
-        <w:gridCol w:w="4677"/>
-      </w:tblGrid>
-      <w:tr>
-        <w:tc>
-          <w:tcPr>
-            <w:tcW w:type="dxa" w:w="4677"/>
-            <w:tcMar>
-              <w:top w:w="30" w:type="dxa"/>
-              <w:bottom w:w="30" w:type="dxa"/>
-              <w:left w:w="50" w:type="dxa"/>
-              <w:right w:w="50" w:type="dxa"/>
-            </w:tcMar>
-            <w:tcBorders>
-              <w:top w:val="none"/>
-              <w:left w:val="none"/>
-              <w:bottom w:val="none"/>
-              <w:right w:val="none"/>
-            </w:tcBorders>
-            <w:tcMar>
-              <w:top w:w="30" w:type="dxa"/>
-              <w:bottom w:w="30" w:type="dxa"/>
-              <w:left w:w="50" w:type="dxa"/>
-              <w:right w:w="50" w:type="dxa"/>
-            </w:tcMar>
-            <w:tcBorders>
-              <w:top w:val="none"/>
-              <w:left w:val="none"/>
-              <w:bottom w:val="none"/>
-              <w:right w:val="none"/>
-            </w:tcBorders>
-          </w:tcPr>
-          <w:p>
-            <w:r>
-              <w:rPr>
-                <w:rFonts w:ascii="Times New Roman" w:hAnsi="Times New Roman"/>
-                <w:b/>
-                <w:color w:val="212121"/>
-                <w:sz w:val="26"/>
-              </w:rPr>
-              <w:t xml:space="preserve">Môn học: </w:t>
-            </w:r>
-            <w:r>
-              <w:rPr>
-                <w:rFonts w:ascii="Times New Roman" w:hAnsi="Times New Roman"/>
-                <w:color w:val="212121"/>
-                <w:sz w:val="26"/>
-              </w:rPr>
-              <w:t>Vật lí 12 (Kết nối tri thức)</w:t>
-            </w:r>
-            <w:r>
-              <w:rPr>
-                <w:rFonts w:ascii="Times New Roman" w:hAnsi="Times New Roman"/>
-                <w:color w:val="212121"/>
-                <w:sz w:val="26"/>
-              </w:rPr>
-              <w:t>Vật lí 12 (Kết nối tri thức)</w:t>
+              <w:t>(Ký và ghi rõ họ tên)</w:t>
             </w:r>
           </w:p>
         </w:tc>
         <w:tc>
           <w:tcPr>
-            <w:tcW w:type="dxa" w:w="4677"/>
-            <w:tcMar>
-              <w:top w:w="30" w:type="dxa"/>
-              <w:bottom w:w="30" w:type="dxa"/>
-              <w:left w:w="50" w:type="dxa"/>
-              <w:right w:w="50" w:type="dxa"/>
-            </w:tcMar>
-            <w:tcBorders>
-              <w:top w:val="none"/>
-              <w:left w:val="none"/>
-              <w:bottom w:val="none"/>
-              <w:right w:val="none"/>
-            </w:tcBorders>
-            <w:tcMar>
-              <w:top w:w="30" w:type="dxa"/>
-              <w:bottom w:w="30" w:type="dxa"/>
-              <w:left w:w="50" w:type="dxa"/>
-              <w:right w:w="50" w:type="dxa"/>
-            </w:tcMar>
-            <w:tcBorders>
-              <w:top w:val="none"/>
-              <w:left w:val="none"/>
-              <w:bottom w:val="none"/>
-              <w:right w:val="none"/>
-            </w:tcBorders>
-          </w:tcPr>
-          <w:p>
-            <w:r>
-              <w:rPr>
-                <w:rFonts w:ascii="Times New Roman" w:hAnsi="Times New Roman"/>
-                <w:b/>
-                <w:color w:val="212121"/>
-                <w:sz w:val="26"/>
-              </w:rPr>
-              <w:t xml:space="preserve">Giáo viên soạn: </w:t>
-            </w:r>
-            <w:r>
-              <w:rPr>
-                <w:rFonts w:ascii="Times New Roman" w:hAnsi="Times New Roman"/>
-                <w:color w:val="212121"/>
-                <w:sz w:val="26"/>
-              </w:rPr>
-              <w:t>Kha Khung Hiệp</w:t>
-            </w:r>
-            <w:r>
-              <w:rPr>
-                <w:rFonts w:ascii="Times New Roman" w:hAnsi="Times New Roman"/>
-                <w:b/>
-                <w:color w:val="212121"/>
-                <w:sz w:val="26"/>
-              </w:rPr>
-              <w:t xml:space="preserve">Giáo viên soạn: </w:t>
-            </w:r>
-            <w:r>
-              <w:rPr>
-                <w:rFonts w:ascii="Times New Roman" w:hAnsi="Times New Roman"/>
-                <w:color w:val="212121"/>
-                <w:sz w:val="26"/>
-              </w:rPr>
-              <w:t>Kha Khung Hiệp</w:t>
-            </w:r>
-          </w:p>
-        </w:tc>
-      </w:tr>
-      <w:tr>
-        <w:tc>
-          <w:tcPr>
-            <w:tcW w:type="dxa" w:w="4677"/>
-            <w:tcMar>
-              <w:top w:w="30" w:type="dxa"/>
-              <w:bottom w:w="30" w:type="dxa"/>
-              <w:left w:w="50" w:type="dxa"/>
-              <w:right w:w="50" w:type="dxa"/>
-            </w:tcMar>
-            <w:tcBorders>
-              <w:top w:val="none"/>
-              <w:left w:val="none"/>
-              <w:bottom w:val="none"/>
-              <w:right w:val="none"/>
-            </w:tcBorders>
-            <w:tcMar>
-              <w:top w:w="30" w:type="dxa"/>
-              <w:bottom w:w="30" w:type="dxa"/>
-              <w:left w:w="50" w:type="dxa"/>
-              <w:right w:w="50" w:type="dxa"/>
-            </w:tcMar>
-            <w:tcBorders>
-              <w:top w:val="none"/>
-              <w:left w:val="none"/>
-              <w:bottom w:val="none"/>
-              <w:right w:val="none"/>
-            </w:tcBorders>
-          </w:tcPr>
-          <w:p>
-            <w:r>
-              <w:rPr>
-                <w:rFonts w:ascii="Times New Roman" w:hAnsi="Times New Roman"/>
-                <w:b/>
-                <w:color w:val="212121"/>
-                <w:sz w:val="26"/>
-              </w:rPr>
-              <w:t xml:space="preserve">Ngày soạn: </w:t>
-            </w:r>
-            <w:r>
-              <w:rPr>
-                <w:rFonts w:ascii="Times New Roman" w:hAnsi="Times New Roman"/>
-                <w:color w:val="212121"/>
-                <w:sz w:val="26"/>
-              </w:rPr>
-              <w:t>30/06/2026</w:t>
-            </w:r>
-            <w:r>
-              <w:rPr>
-                <w:rFonts w:ascii="Times New Roman" w:hAnsi="Times New Roman"/>
-                <w:b/>
-                <w:color w:val="212121"/>
-                <w:sz w:val="26"/>
-              </w:rPr>
-              <w:t xml:space="preserve">Ngày soạn: </w:t>
-            </w:r>
-            <w:r>
-              <w:rPr>
-                <w:rFonts w:ascii="Times New Roman" w:hAnsi="Times New Roman"/>
-                <w:color w:val="212121"/>
-                <w:sz w:val="26"/>
-              </w:rPr>
-              <w:t>30/06/2026</w:t>
-            </w:r>
-          </w:p>
-        </w:tc>
-        <w:tc>
-          <w:tcPr>
-            <w:tcW w:type="dxa" w:w="4677"/>
-            <w:tcMar>
-              <w:top w:w="30" w:type="dxa"/>
-              <w:bottom w:w="30" w:type="dxa"/>
-              <w:left w:w="50" w:type="dxa"/>
-              <w:right w:w="50" w:type="dxa"/>
-            </w:tcMar>
-            <w:tcBorders>
-              <w:top w:val="none"/>
-              <w:left w:val="none"/>
-              <w:bottom w:val="none"/>
-              <w:right w:val="none"/>
-            </w:tcBorders>
-            <w:tcMar>
-              <w:top w:w="30" w:type="dxa"/>
-              <w:bottom w:w="30" w:type="dxa"/>
-              <w:left w:w="50" w:type="dxa"/>
-              <w:right w:w="50" w:type="dxa"/>
-            </w:tcMar>
-            <w:tcBorders>
-              <w:top w:val="none"/>
-              <w:left w:val="none"/>
-              <w:bottom w:val="none"/>
-              <w:right w:val="none"/>
-            </w:tcBorders>
-          </w:tcPr>
-          <w:p>
-            <w:r>
-              <w:rPr>
-                <w:rFonts w:ascii="Times New Roman" w:hAnsi="Times New Roman"/>
-                <w:b/>
-                <w:color w:val="212121"/>
-                <w:sz w:val="26"/>
-              </w:rPr>
-              <w:t xml:space="preserve">Thời lượng thực hiện: </w:t>
-            </w:r>
-            <w:r>
-              <w:rPr>
-                <w:rFonts w:ascii="Times New Roman" w:hAnsi="Times New Roman"/>
-                <w:color w:val="212121"/>
-                <w:sz w:val="26"/>
-              </w:rPr>
-              <w:t>2 tiết</w:t>
-            </w:r>
-            <w:r>
-              <w:rPr>
-                <w:rFonts w:ascii="Times New Roman" w:hAnsi="Times New Roman"/>
-                <w:b/>
-                <w:color w:val="212121"/>
-                <w:sz w:val="26"/>
-              </w:rPr>
-              <w:t xml:space="preserve">Thời lượng thực hiện: </w:t>
-            </w:r>
-            <w:r>
-              <w:rPr>
-                <w:rFonts w:ascii="Times New Roman" w:hAnsi="Times New Roman"/>
-                <w:color w:val="212121"/>
-                <w:sz w:val="26"/>
-              </w:rPr>
-              <w:t>2 tiết</w:t>
-            </w:r>
-          </w:p>
-        </w:tc>
-      </w:tr>
-    </w:tbl>
-    <w:p>
-      <w:pPr>
-        <w:spacing w:before="120" w:after="120"/>
-        <w:jc w:val="center"/>
-      </w:pPr>
-      <w:r>
-        <w:rPr>
-          <w:color w:val="BFBFBF"/>
-          <w:sz w:val="16"/>
-        </w:rPr>
-        <w:t>——————————————————————————————————————————————————————————————————————</w:t>
-      </w:r>
-    </w:p>
-    <w:p>
-      <w:pPr>
-        <w:spacing w:after="80"/>
-      </w:pPr>
-      <w:r>
-        <w:rPr>
-          <w:rFonts w:ascii="Times New Roman" w:hAnsi="Times New Roman"/>
-          <w:b/>
-          <w:color w:val="212121"/>
-          <w:sz w:val="26"/>
-        </w:rPr>
-        <w:t>Giáo viên thực hiện:</w:t>
-      </w:r>
-      <w:r>
-        <w:rPr>
-          <w:rFonts w:ascii="Times New Roman" w:hAnsi="Times New Roman"/>
-          <w:color w:val="212121"/>
-          <w:sz w:val="26"/>
-        </w:rPr>
-        <w:t xml:space="preserve"> Kha Khung Hiệp</w:t>
-      </w:r>
-    </w:p>
-    <w:p>
-      <w:pPr>
-        <w:spacing w:after="80"/>
-      </w:pPr>
-      <w:r>
-        <w:rPr>
-          <w:rFonts w:ascii="Times New Roman" w:hAnsi="Times New Roman"/>
-          <w:b/>
-          <w:color w:val="212121"/>
-          <w:sz w:val="26"/>
-        </w:rPr>
-        <w:t>Thời lượng:</w:t>
-      </w:r>
-      <w:r>
-        <w:rPr>
-          <w:rFonts w:ascii="Times New Roman" w:hAnsi="Times New Roman"/>
-          <w:color w:val="212121"/>
-          <w:sz w:val="26"/>
-        </w:rPr>
-        <w:t xml:space="preserve"> 2 tiết</w:t>
-      </w:r>
-    </w:p>
-    <w:p>
-      <w:pPr>
-        <w:spacing w:before="280" w:after="120"/>
-      </w:pPr>
-      <w:r>
-        <w:rPr>
-          <w:rFonts w:ascii="Times New Roman" w:hAnsi="Times New Roman"/>
-          <w:b/>
-          <w:color w:val="1E3A5F"/>
-          <w:sz w:val="28"/>
-        </w:rPr>
-        <w:t>I. MỤC TIÊU BÀI HỌC</w:t>
-      </w:r>
-    </w:p>
-    <w:p>
-      <w:pPr>
-        <w:spacing w:after="80"/>
-        <w:ind w:left="283" w:hanging="170"/>
-      </w:pPr>
-      <w:r>
-        <w:rPr>
-          <w:rFonts w:ascii="Times New Roman" w:hAnsi="Times New Roman"/>
-          <w:color w:val="212121"/>
-          <w:sz w:val="26"/>
-        </w:rPr>
-        <w:t xml:space="preserve">- </w:t>
-      </w:r>
-      <w:r>
-        <w:rPr>
-          <w:rFonts w:ascii="Times New Roman" w:hAnsi="Times New Roman"/>
-          <w:color w:val="212121"/>
-          <w:sz w:val="26"/>
-        </w:rPr>
-        <w:t xml:space="preserve">  </w:t>
-      </w:r>
-      <w:r>
-        <w:rPr>
-          <w:rFonts w:ascii="Times New Roman" w:hAnsi="Times New Roman"/>
-          <w:b/>
-          <w:color w:val="212121"/>
-          <w:sz w:val="26"/>
-        </w:rPr>
-        <w:t>Kiến thức:</w:t>
-      </w:r>
-      <w:r>
-        <w:rPr>
-          <w:rFonts w:ascii="Times New Roman" w:hAnsi="Times New Roman"/>
-          <w:color w:val="212121"/>
-          <w:sz w:val="26"/>
-        </w:rPr>
-        <w:t xml:space="preserve"> Giúp học sinh hiểu khái niệm nhiệt dung riêng, viết công thức và nắm được phương pháp đo thực nghiệm.</w:t>
-      </w:r>
-    </w:p>
-    <w:p>
-      <w:pPr>
-        <w:spacing w:after="80"/>
-        <w:ind w:left="283" w:hanging="170"/>
-      </w:pPr>
-      <w:r>
-        <w:rPr>
-          <w:rFonts w:ascii="Times New Roman" w:hAnsi="Times New Roman"/>
-          <w:color w:val="212121"/>
-          <w:sz w:val="26"/>
-        </w:rPr>
-        <w:t xml:space="preserve">- </w:t>
-      </w:r>
-      <w:r>
-        <w:rPr>
-          <w:rFonts w:ascii="Times New Roman" w:hAnsi="Times New Roman"/>
-          <w:color w:val="212121"/>
-          <w:sz w:val="26"/>
-        </w:rPr>
-        <w:t xml:space="preserve">  </w:t>
-      </w:r>
-      <w:r>
-        <w:rPr>
-          <w:rFonts w:ascii="Times New Roman" w:hAnsi="Times New Roman"/>
-          <w:b/>
-          <w:color w:val="212121"/>
-          <w:sz w:val="26"/>
-        </w:rPr>
-        <w:t>Kỹ năng:</w:t>
-      </w:r>
-      <w:r>
-        <w:rPr>
-          <w:rFonts w:ascii="Times New Roman" w:hAnsi="Times New Roman"/>
-          <w:color w:val="212121"/>
-          <w:sz w:val="26"/>
-        </w:rPr>
-        <w:t xml:space="preserve"> Lắp ráp dụng cụ thí nghiệm, thu thập số liệu, tính toán sai số vật lý.</w:t>
-      </w:r>
-    </w:p>
-    <w:p>
-      <w:pPr>
-        <w:spacing w:before="280" w:after="120"/>
-      </w:pPr>
-      <w:r>
-        <w:rPr>
-          <w:rFonts w:ascii="Times New Roman" w:hAnsi="Times New Roman"/>
-          <w:b/>
-          <w:color w:val="1E3A5F"/>
-          <w:sz w:val="28"/>
-        </w:rPr>
-        <w:t>II. TIẾN TRÌNH DẠY HỌC</w:t>
-      </w:r>
-    </w:p>
-    <w:p>
-      <w:pPr>
-        <w:spacing w:before="200" w:after="80"/>
-      </w:pPr>
-      <w:r>
-        <w:rPr>
-          <w:rFonts w:ascii="Times New Roman" w:hAnsi="Times New Roman"/>
-          <w:b/>
-          <w:color w:val="595959"/>
-          <w:sz w:val="26"/>
-        </w:rPr>
-        <w:t>1. Hoạt động 1: Khởi động (10 phút)</w:t>
-      </w:r>
-    </w:p>
-    <w:p>
-      <w:pPr>
-        <w:spacing w:after="80"/>
-        <w:ind w:left="283" w:hanging="170"/>
-      </w:pPr>
-      <w:r>
-        <w:rPr>
-          <w:rFonts w:ascii="Times New Roman" w:hAnsi="Times New Roman"/>
-          <w:color w:val="212121"/>
-          <w:sz w:val="26"/>
-        </w:rPr>
-        <w:t xml:space="preserve">- </w:t>
-      </w:r>
-      <w:r>
-        <w:rPr>
-          <w:rFonts w:ascii="Times New Roman" w:hAnsi="Times New Roman"/>
-          <w:color w:val="212121"/>
-          <w:sz w:val="26"/>
-        </w:rPr>
-        <w:t xml:space="preserve">  Đặt vấn đề thông qua hiện tượng đun nước và dầu ăn.</w:t>
-      </w:r>
-    </w:p>
-    <w:p>
-      <w:pPr>
-        <w:spacing w:after="80"/>
-        <w:ind w:left="283" w:hanging="170"/>
-      </w:pPr>
-      <w:r>
-        <w:rPr>
-          <w:rFonts w:ascii="Times New Roman" w:hAnsi="Times New Roman"/>
-          <w:color w:val="212121"/>
-          <w:sz w:val="26"/>
-        </w:rPr>
-        <w:t xml:space="preserve">- </w:t>
-      </w:r>
-      <w:r>
-        <w:rPr>
-          <w:rFonts w:ascii="Times New Roman" w:hAnsi="Times New Roman"/>
-          <w:color w:val="212121"/>
-          <w:sz w:val="26"/>
-        </w:rPr>
-        <w:t xml:space="preserve">  Cho học sinh thảo luận cặp đôi về mệnh đề của Nhiệm vụ 1 trong Phiếu học tập.</w:t>
-      </w:r>
-    </w:p>
-    <w:p>
-      <w:pPr>
-        <w:spacing w:before="200" w:after="80"/>
-      </w:pPr>
-      <w:r>
-        <w:rPr>
-          <w:rFonts w:ascii="Times New Roman" w:hAnsi="Times New Roman"/>
-          <w:b/>
-          <w:color w:val="595959"/>
-          <w:sz w:val="26"/>
-        </w:rPr>
-        <w:t>2. Hoạt động 2: Hình thành kiến thức khái niệm (25 phút)</w:t>
-      </w:r>
-    </w:p>
-    <w:p>
-      <w:pPr>
-        <w:spacing w:after="80"/>
-        <w:ind w:left="283" w:hanging="170"/>
-      </w:pPr>
-      <w:r>
-        <w:rPr>
-          <w:rFonts w:ascii="Times New Roman" w:hAnsi="Times New Roman"/>
-          <w:color w:val="212121"/>
-          <w:sz w:val="26"/>
-        </w:rPr>
-        <w:t xml:space="preserve">- </w:t>
-      </w:r>
-      <w:r>
-        <w:rPr>
-          <w:rFonts w:ascii="Times New Roman" w:hAnsi="Times New Roman"/>
-          <w:color w:val="212121"/>
-          <w:sz w:val="26"/>
-        </w:rPr>
-        <w:t xml:space="preserve">  Chốt định nghĩa nhiệt dung riêng, phân tích đơn vị </w:t>
-      </w:r>
-      <w:r>
-        <w:rPr>
-          <w:rFonts w:ascii="Times New Roman" w:hAnsi="Times New Roman"/>
-          <w:i/>
-          <w:color w:val="212121"/>
-          <w:sz w:val="26"/>
-        </w:rPr>
-        <w:t>J/kg.K</w:t>
-      </w:r>
-      <w:r>
-        <w:rPr>
-          <w:rFonts w:ascii="Times New Roman" w:hAnsi="Times New Roman"/>
-          <w:color w:val="212121"/>
-          <w:sz w:val="26"/>
-        </w:rPr>
-        <w:t>.</w:t>
-      </w:r>
-    </w:p>
-    <w:p>
-      <w:pPr>
-        <w:spacing w:after="80"/>
-        <w:ind w:left="283" w:hanging="170"/>
-      </w:pPr>
-      <w:r>
-        <w:rPr>
-          <w:rFonts w:ascii="Times New Roman" w:hAnsi="Times New Roman"/>
-          <w:color w:val="212121"/>
-          <w:sz w:val="26"/>
-        </w:rPr>
-        <w:t xml:space="preserve">- </w:t>
-      </w:r>
-      <w:r>
-        <w:rPr>
-          <w:rFonts w:ascii="Times New Roman" w:hAnsi="Times New Roman"/>
-          <w:color w:val="212121"/>
-          <w:sz w:val="26"/>
-        </w:rPr>
-        <w:t xml:space="preserve">  Hướng dẫn học sinh giải thích hiện tượng khí hậu biển (Nhiệm vụ 2).</w:t>
-      </w:r>
-    </w:p>
-    <w:p>
-      <w:pPr>
-        <w:spacing w:before="200" w:after="80"/>
-      </w:pPr>
-      <w:r>
-        <w:rPr>
-          <w:rFonts w:ascii="Times New Roman" w:hAnsi="Times New Roman"/>
-          <w:b/>
-          <w:color w:val="595959"/>
-          <w:sz w:val="26"/>
-        </w:rPr>
-        <w:t>3. Hoạt động 3: Hướng dẫn thực hành thí nghiệm (35 phút)</w:t>
-      </w:r>
-    </w:p>
-    <w:p>
-      <w:pPr>
-        <w:spacing w:after="80"/>
-        <w:ind w:left="283" w:hanging="170"/>
-      </w:pPr>
-      <w:r>
-        <w:rPr>
-          <w:rFonts w:ascii="Times New Roman" w:hAnsi="Times New Roman"/>
-          <w:color w:val="212121"/>
-          <w:sz w:val="26"/>
-        </w:rPr>
-        <w:t xml:space="preserve">- </w:t>
-      </w:r>
-      <w:r>
-        <w:rPr>
-          <w:rFonts w:ascii="Times New Roman" w:hAnsi="Times New Roman"/>
-          <w:color w:val="212121"/>
-          <w:sz w:val="26"/>
-        </w:rPr>
-        <w:t xml:space="preserve">  Giới thiệu sơ đồ thiết bị nhiệt lượng kế và watt kế kỹ thuật số.</w:t>
-      </w:r>
-    </w:p>
-    <w:p>
-      <w:pPr>
-        <w:spacing w:after="80"/>
-        <w:ind w:left="283" w:hanging="170"/>
-      </w:pPr>
-      <w:r>
-        <w:rPr>
-          <w:rFonts w:ascii="Times New Roman" w:hAnsi="Times New Roman"/>
-          <w:color w:val="212121"/>
-          <w:sz w:val="26"/>
-        </w:rPr>
-        <w:t xml:space="preserve">- </w:t>
-      </w:r>
-      <w:r>
-        <w:rPr>
-          <w:rFonts w:ascii="Times New Roman" w:hAnsi="Times New Roman"/>
-          <w:color w:val="212121"/>
-          <w:sz w:val="26"/>
-        </w:rPr>
-        <w:t xml:space="preserve">  Sắp xếp thứ tự các bước thực nghiệm của học sinh.</w:t>
-      </w:r>
-    </w:p>
-    <w:p>
-      <w:pPr>
-        <w:spacing w:after="80"/>
-        <w:ind w:left="283" w:hanging="170"/>
-      </w:pPr>
-      <w:r>
-        <w:rPr>
-          <w:rFonts w:ascii="Times New Roman" w:hAnsi="Times New Roman"/>
-          <w:color w:val="212121"/>
-          <w:sz w:val="26"/>
-        </w:rPr>
-        <w:t xml:space="preserve">- </w:t>
-      </w:r>
-      <w:r>
-        <w:rPr>
-          <w:rFonts w:ascii="Times New Roman" w:hAnsi="Times New Roman"/>
-          <w:color w:val="212121"/>
-          <w:sz w:val="26"/>
-        </w:rPr>
-        <w:t xml:space="preserve">  Phân tích công thức tính sai số: </w:t>
-      </w:r>
-      <w:r>
-        <w:rPr>
-          <w:rFonts w:ascii="Times New Roman" w:hAnsi="Times New Roman"/>
-          <w:i/>
-          <w:color w:val="212121"/>
-          <w:sz w:val="26"/>
-        </w:rPr>
-        <w:t>frac{Δ c}{c} = frac{Δ P}{P} + frac{Δ t}{t} + frac{Δ m}{m} + frac{Δ (Δ T)}{Δ T}</w:t>
-      </w:r>
-      <w:r>
-        <w:rPr>
-          <w:rFonts w:ascii="Times New Roman" w:hAnsi="Times New Roman"/>
-          <w:color w:val="212121"/>
-          <w:sz w:val="26"/>
-        </w:rPr>
-        <w:t>.</w:t>
-      </w:r>
-    </w:p>
-    <w:p>
-      <w:pPr>
-        <w:spacing w:before="200" w:after="80"/>
-      </w:pPr>
-      <w:r>
-        <w:rPr>
-          <w:rFonts w:ascii="Times New Roman" w:hAnsi="Times New Roman"/>
-          <w:b/>
-          <w:color w:val="595959"/>
-          <w:sz w:val="26"/>
-        </w:rPr>
-        <w:t>4. Hoạt động 4: Vận dụng &amp; Tổng kết (20 phút)</w:t>
-      </w:r>
-    </w:p>
-    <w:p>
-      <w:pPr>
-        <w:spacing w:after="80"/>
-        <w:ind w:left="283" w:hanging="170"/>
-      </w:pPr>
-      <w:r>
-        <w:rPr>
-          <w:rFonts w:ascii="Times New Roman" w:hAnsi="Times New Roman"/>
-          <w:color w:val="212121"/>
-          <w:sz w:val="26"/>
-        </w:rPr>
-        <w:t xml:space="preserve">- </w:t>
-      </w:r>
-      <w:r>
-        <w:rPr>
-          <w:rFonts w:ascii="Times New Roman" w:hAnsi="Times New Roman"/>
-          <w:color w:val="212121"/>
-          <w:sz w:val="26"/>
-        </w:rPr>
-        <w:t xml:space="preserve">  Giao bài tập tính toán sai số thực hành đo.</w:t>
-      </w:r>
-    </w:p>
-    <w:p>
-      <w:pPr>
-        <w:spacing w:after="80"/>
-        <w:ind w:left="283" w:hanging="170"/>
-      </w:pPr>
-      <w:r>
-        <w:rPr>
-          <w:rFonts w:ascii="Times New Roman" w:hAnsi="Times New Roman"/>
-          <w:color w:val="212121"/>
-          <w:sz w:val="26"/>
-        </w:rPr>
-        <w:t xml:space="preserve">- </w:t>
-      </w:r>
-      <w:r>
-        <w:rPr>
-          <w:rFonts w:ascii="Times New Roman" w:hAnsi="Times New Roman"/>
-          <w:color w:val="212121"/>
-          <w:sz w:val="26"/>
-        </w:rPr>
-        <w:t xml:space="preserve">  Giao bài tập về nhà bối cảnh thực tế.</w:t>
-      </w:r>
-    </w:p>
-    <w:p>
-      <w:pPr>
-        <w:spacing w:before="120" w:after="120"/>
-        <w:jc w:val="center"/>
-      </w:pPr>
-      <w:r>
-        <w:rPr>
-          <w:color w:val="BFBFBF"/>
-          <w:sz w:val="16"/>
-        </w:rPr>
-        <w:t>——————————————————————————————————————————————————————————————————————</w:t>
-      </w:r>
-    </w:p>
-    <w:p>
-      <w:pPr>
-        <w:spacing w:after="80"/>
-      </w:pPr>
-      <w:r>
-        <w:rPr>
-          <w:rFonts w:ascii="Times New Roman" w:hAnsi="Times New Roman"/>
-          <w:b/>
-          <w:color w:val="212121"/>
-          <w:sz w:val="26"/>
-        </w:rPr>
-        <w:t>Giáo viên thực hiện:</w:t>
-      </w:r>
-      <w:r>
-        <w:rPr>
-          <w:rFonts w:ascii="Times New Roman" w:hAnsi="Times New Roman"/>
-          <w:color w:val="212121"/>
-          <w:sz w:val="26"/>
-        </w:rPr>
-        <w:t xml:space="preserve"> Kha Khung Hiệp</w:t>
-      </w:r>
-    </w:p>
-    <w:p>
-      <w:pPr>
-        <w:spacing w:after="80"/>
-      </w:pPr>
-      <w:r>
-        <w:rPr>
-          <w:rFonts w:ascii="Times New Roman" w:hAnsi="Times New Roman"/>
-          <w:b/>
-          <w:color w:val="212121"/>
-          <w:sz w:val="26"/>
-        </w:rPr>
-        <w:t>Thời lượng:</w:t>
-      </w:r>
-      <w:r>
-        <w:rPr>
-          <w:rFonts w:ascii="Times New Roman" w:hAnsi="Times New Roman"/>
-          <w:color w:val="212121"/>
-          <w:sz w:val="26"/>
-        </w:rPr>
-        <w:t xml:space="preserve"> 2 tiết</w:t>
-      </w:r>
-    </w:p>
-    <w:p>
-      <w:pPr>
-        <w:spacing w:before="280" w:after="120"/>
-      </w:pPr>
-      <w:r>
-        <w:rPr>
-          <w:rFonts w:ascii="Times New Roman" w:hAnsi="Times New Roman"/>
-          <w:b/>
-          <w:color w:val="1E3A5F"/>
-          <w:sz w:val="28"/>
-        </w:rPr>
-        <w:t>I. MỤC TIÊU BÀI HỌC</w:t>
-      </w:r>
-    </w:p>
-    <w:p>
-      <w:pPr>
-        <w:spacing w:after="80"/>
-        <w:ind w:left="283" w:hanging="170"/>
-      </w:pPr>
-      <w:r>
-        <w:rPr>
-          <w:rFonts w:ascii="Times New Roman" w:hAnsi="Times New Roman"/>
-          <w:color w:val="212121"/>
-          <w:sz w:val="26"/>
-        </w:rPr>
-        <w:t xml:space="preserve">- </w:t>
-      </w:r>
-      <w:r>
-        <w:rPr>
-          <w:rFonts w:ascii="Times New Roman" w:hAnsi="Times New Roman"/>
-          <w:color w:val="212121"/>
-          <w:sz w:val="26"/>
-        </w:rPr>
-        <w:t xml:space="preserve">  </w:t>
-      </w:r>
-      <w:r>
-        <w:rPr>
-          <w:rFonts w:ascii="Times New Roman" w:hAnsi="Times New Roman"/>
-          <w:b/>
-          <w:color w:val="212121"/>
-          <w:sz w:val="26"/>
-        </w:rPr>
-        <w:t>Kiến thức:</w:t>
-      </w:r>
-      <w:r>
-        <w:rPr>
-          <w:rFonts w:ascii="Times New Roman" w:hAnsi="Times New Roman"/>
-          <w:color w:val="212121"/>
-          <w:sz w:val="26"/>
-        </w:rPr>
-        <w:t xml:space="preserve"> Giúp học sinh hiểu khái niệm nhiệt dung riêng, viết công thức và nắm được phương pháp đo thực nghiệm.</w:t>
-      </w:r>
-    </w:p>
-    <w:p>
-      <w:pPr>
-        <w:spacing w:after="80"/>
-        <w:ind w:left="283" w:hanging="170"/>
-      </w:pPr>
-      <w:r>
-        <w:rPr>
-          <w:rFonts w:ascii="Times New Roman" w:hAnsi="Times New Roman"/>
-          <w:color w:val="212121"/>
-          <w:sz w:val="26"/>
-        </w:rPr>
-        <w:t xml:space="preserve">- </w:t>
-      </w:r>
-      <w:r>
-        <w:rPr>
-          <w:rFonts w:ascii="Times New Roman" w:hAnsi="Times New Roman"/>
-          <w:color w:val="212121"/>
-          <w:sz w:val="26"/>
-        </w:rPr>
-        <w:t xml:space="preserve">  </w:t>
-      </w:r>
-      <w:r>
-        <w:rPr>
-          <w:rFonts w:ascii="Times New Roman" w:hAnsi="Times New Roman"/>
-          <w:b/>
-          <w:color w:val="212121"/>
-          <w:sz w:val="26"/>
-        </w:rPr>
-        <w:t>Kỹ năng:</w:t>
-      </w:r>
-      <w:r>
-        <w:rPr>
-          <w:rFonts w:ascii="Times New Roman" w:hAnsi="Times New Roman"/>
-          <w:color w:val="212121"/>
-          <w:sz w:val="26"/>
-        </w:rPr>
-        <w:t xml:space="preserve"> Lắp ráp dụng cụ thí nghiệm, thu thập số liệu, tính toán sai số vật lý.</w:t>
-      </w:r>
-    </w:p>
-    <w:p>
-      <w:pPr>
-        <w:spacing w:before="280" w:after="120"/>
-      </w:pPr>
-      <w:r>
-        <w:rPr>
-          <w:rFonts w:ascii="Times New Roman" w:hAnsi="Times New Roman"/>
-          <w:b/>
-          <w:color w:val="1E3A5F"/>
-          <w:sz w:val="28"/>
-        </w:rPr>
-        <w:t>II. TIẾN TRÌNH DẠY HỌC</w:t>
-      </w:r>
-    </w:p>
-    <w:p>
-      <w:pPr>
-        <w:spacing w:before="200" w:after="80"/>
-      </w:pPr>
-      <w:r>
-        <w:rPr>
-          <w:rFonts w:ascii="Times New Roman" w:hAnsi="Times New Roman"/>
-          <w:b/>
-          <w:color w:val="595959"/>
-          <w:sz w:val="26"/>
-        </w:rPr>
-        <w:t>1. Hoạt động 1: Khởi động (10 phút)</w:t>
-      </w:r>
-    </w:p>
-    <w:p>
-      <w:pPr>
-        <w:spacing w:after="80"/>
-        <w:ind w:left="283" w:hanging="170"/>
-      </w:pPr>
-      <w:r>
-        <w:rPr>
-          <w:rFonts w:ascii="Times New Roman" w:hAnsi="Times New Roman"/>
-          <w:color w:val="212121"/>
-          <w:sz w:val="26"/>
-        </w:rPr>
-        <w:t xml:space="preserve">- </w:t>
-      </w:r>
-      <w:r>
-        <w:rPr>
-          <w:rFonts w:ascii="Times New Roman" w:hAnsi="Times New Roman"/>
-          <w:color w:val="212121"/>
-          <w:sz w:val="26"/>
-        </w:rPr>
-        <w:t xml:space="preserve">  Đặt vấn đề thông qua hiện tượng đun nước và dầu ăn.</w:t>
-      </w:r>
-    </w:p>
-    <w:p>
-      <w:pPr>
-        <w:spacing w:after="80"/>
-        <w:ind w:left="283" w:hanging="170"/>
-      </w:pPr>
-      <w:r>
-        <w:rPr>
-          <w:rFonts w:ascii="Times New Roman" w:hAnsi="Times New Roman"/>
-          <w:color w:val="212121"/>
-          <w:sz w:val="26"/>
-        </w:rPr>
-        <w:t xml:space="preserve">- </w:t>
-      </w:r>
-      <w:r>
-        <w:rPr>
-          <w:rFonts w:ascii="Times New Roman" w:hAnsi="Times New Roman"/>
-          <w:color w:val="212121"/>
-          <w:sz w:val="26"/>
-        </w:rPr>
-        <w:t xml:space="preserve">  Cho học sinh thảo luận cặp đôi về mệnh đề của Nhiệm vụ 1 trong Phiếu học tập.</w:t>
-      </w:r>
-    </w:p>
-    <w:p>
-      <w:pPr>
-        <w:spacing w:before="200" w:after="80"/>
-      </w:pPr>
-      <w:r>
-        <w:rPr>
-          <w:rFonts w:ascii="Times New Roman" w:hAnsi="Times New Roman"/>
-          <w:b/>
-          <w:color w:val="595959"/>
-          <w:sz w:val="26"/>
-        </w:rPr>
-        <w:t>2. Hoạt động 2: Hình thành kiến thức khái niệm (25 phút)</w:t>
-      </w:r>
-    </w:p>
-    <w:p>
-      <w:pPr>
-        <w:spacing w:after="80"/>
-        <w:ind w:left="283" w:hanging="170"/>
-      </w:pPr>
-      <w:r>
-        <w:rPr>
-          <w:rFonts w:ascii="Times New Roman" w:hAnsi="Times New Roman"/>
-          <w:color w:val="212121"/>
-          <w:sz w:val="26"/>
-        </w:rPr>
-        <w:t xml:space="preserve">- </w:t>
-      </w:r>
-      <w:r>
-        <w:rPr>
-          <w:rFonts w:ascii="Times New Roman" w:hAnsi="Times New Roman"/>
-          <w:color w:val="212121"/>
-          <w:sz w:val="26"/>
-        </w:rPr>
-        <w:t xml:space="preserve">  Chốt định nghĩa nhiệt dung riêng, phân tích đơn vị </w:t>
-      </w:r>
-      <w:r>
-        <w:rPr>
-          <w:rFonts w:ascii="Times New Roman" w:hAnsi="Times New Roman"/>
-          <w:i/>
-          <w:color w:val="212121"/>
-          <w:sz w:val="26"/>
-        </w:rPr>
-        <w:t>J/kg.K</w:t>
-      </w:r>
-      <w:r>
-        <w:rPr>
-          <w:rFonts w:ascii="Times New Roman" w:hAnsi="Times New Roman"/>
-          <w:color w:val="212121"/>
-          <w:sz w:val="26"/>
-        </w:rPr>
-        <w:t>.</w:t>
-      </w:r>
-    </w:p>
-    <w:p>
-      <w:pPr>
-        <w:spacing w:after="80"/>
-        <w:ind w:left="283" w:hanging="170"/>
-      </w:pPr>
-      <w:r>
-        <w:rPr>
-          <w:rFonts w:ascii="Times New Roman" w:hAnsi="Times New Roman"/>
-          <w:color w:val="212121"/>
-          <w:sz w:val="26"/>
-        </w:rPr>
-        <w:t xml:space="preserve">- </w:t>
-      </w:r>
-      <w:r>
-        <w:rPr>
-          <w:rFonts w:ascii="Times New Roman" w:hAnsi="Times New Roman"/>
-          <w:color w:val="212121"/>
-          <w:sz w:val="26"/>
-        </w:rPr>
-        <w:t xml:space="preserve">  Hướng dẫn học sinh giải thích hiện tượng khí hậu biển (Nhiệm vụ 2).</w:t>
-      </w:r>
-    </w:p>
-    <w:p>
-      <w:pPr>
-        <w:spacing w:before="200" w:after="80"/>
-      </w:pPr>
-      <w:r>
-        <w:rPr>
-          <w:rFonts w:ascii="Times New Roman" w:hAnsi="Times New Roman"/>
-          <w:b/>
-          <w:color w:val="595959"/>
-          <w:sz w:val="26"/>
-        </w:rPr>
-        <w:t>3. Hoạt động 3: Hướng dẫn thực hành thí nghiệm (35 phút)</w:t>
-      </w:r>
-    </w:p>
-    <w:p>
-      <w:pPr>
-        <w:spacing w:after="80"/>
-        <w:ind w:left="283" w:hanging="170"/>
-      </w:pPr>
-      <w:r>
-        <w:rPr>
-          <w:rFonts w:ascii="Times New Roman" w:hAnsi="Times New Roman"/>
-          <w:color w:val="212121"/>
-          <w:sz w:val="26"/>
-        </w:rPr>
-        <w:t xml:space="preserve">- </w:t>
-      </w:r>
-      <w:r>
-        <w:rPr>
-          <w:rFonts w:ascii="Times New Roman" w:hAnsi="Times New Roman"/>
-          <w:color w:val="212121"/>
-          <w:sz w:val="26"/>
-        </w:rPr>
-        <w:t xml:space="preserve">  Giới thiệu sơ đồ thiết bị nhiệt lượng kế và watt kế kỹ thuật số.</w:t>
-      </w:r>
-    </w:p>
-    <w:p>
-      <w:pPr>
-        <w:spacing w:after="80"/>
-        <w:ind w:left="283" w:hanging="170"/>
-      </w:pPr>
-      <w:r>
-        <w:rPr>
-          <w:rFonts w:ascii="Times New Roman" w:hAnsi="Times New Roman"/>
-          <w:color w:val="212121"/>
-          <w:sz w:val="26"/>
-        </w:rPr>
-        <w:t xml:space="preserve">- </w:t>
-      </w:r>
-      <w:r>
-        <w:rPr>
-          <w:rFonts w:ascii="Times New Roman" w:hAnsi="Times New Roman"/>
-          <w:color w:val="212121"/>
-          <w:sz w:val="26"/>
-        </w:rPr>
-        <w:t xml:space="preserve">  Sắp xếp thứ tự các bước thực nghiệm của học sinh.</w:t>
-      </w:r>
-    </w:p>
-    <w:p>
-      <w:pPr>
-        <w:spacing w:after="80"/>
-        <w:ind w:left="283" w:hanging="170"/>
-      </w:pPr>
-      <w:r>
-        <w:rPr>
-          <w:rFonts w:ascii="Times New Roman" w:hAnsi="Times New Roman"/>
-          <w:color w:val="212121"/>
-          <w:sz w:val="26"/>
-        </w:rPr>
-        <w:t xml:space="preserve">- </w:t>
-      </w:r>
-      <w:r>
-        <w:rPr>
-          <w:rFonts w:ascii="Times New Roman" w:hAnsi="Times New Roman"/>
-          <w:color w:val="212121"/>
-          <w:sz w:val="26"/>
-        </w:rPr>
-        <w:t xml:space="preserve">  Phân tích công thức tính sai số: </w:t>
-      </w:r>
-      <w:r>
-        <w:rPr>
-          <w:rFonts w:ascii="Times New Roman" w:hAnsi="Times New Roman"/>
-          <w:i/>
-          <w:color w:val="212121"/>
-          <w:sz w:val="26"/>
-        </w:rPr>
-        <w:t>frac{Δ c}{c} = frac{Δ P}{P} + frac{Δ t}{t} + frac{Δ m}{m} + frac{Δ (Δ T)}{Δ T}</w:t>
-      </w:r>
-      <w:r>
-        <w:rPr>
-          <w:rFonts w:ascii="Times New Roman" w:hAnsi="Times New Roman"/>
-          <w:color w:val="212121"/>
-          <w:sz w:val="26"/>
-        </w:rPr>
-        <w:t>.</w:t>
-      </w:r>
-    </w:p>
-    <w:p>
-      <w:pPr>
-        <w:spacing w:before="200" w:after="80"/>
-      </w:pPr>
-      <w:r>
-        <w:rPr>
-          <w:rFonts w:ascii="Times New Roman" w:hAnsi="Times New Roman"/>
-          <w:b/>
-          <w:color w:val="595959"/>
-          <w:sz w:val="26"/>
-        </w:rPr>
-        <w:t>4. Hoạt động 4: Vận dụng &amp; Tổng kết (20 phút)</w:t>
-      </w:r>
-    </w:p>
-    <w:p>
-      <w:pPr>
-        <w:spacing w:after="80"/>
-        <w:ind w:left="283" w:hanging="170"/>
-      </w:pPr>
-      <w:r>
-        <w:rPr>
-          <w:rFonts w:ascii="Times New Roman" w:hAnsi="Times New Roman"/>
-          <w:color w:val="212121"/>
-          <w:sz w:val="26"/>
-        </w:rPr>
-        <w:t xml:space="preserve">- </w:t>
-      </w:r>
-      <w:r>
-        <w:rPr>
-          <w:rFonts w:ascii="Times New Roman" w:hAnsi="Times New Roman"/>
-          <w:color w:val="212121"/>
-          <w:sz w:val="26"/>
-        </w:rPr>
-        <w:t xml:space="preserve">  Giao bài tập tính toán sai số thực hành đo.</w:t>
-      </w:r>
-    </w:p>
-    <w:p>
-      <w:pPr>
-        <w:spacing w:after="80"/>
-        <w:ind w:left="283" w:hanging="170"/>
-      </w:pPr>
-      <w:r>
-        <w:rPr>
-          <w:rFonts w:ascii="Times New Roman" w:hAnsi="Times New Roman"/>
-          <w:color w:val="212121"/>
-          <w:sz w:val="26"/>
-        </w:rPr>
-        <w:t xml:space="preserve">- </w:t>
-      </w:r>
-      <w:r>
-        <w:rPr>
-          <w:rFonts w:ascii="Times New Roman" w:hAnsi="Times New Roman"/>
-          <w:color w:val="212121"/>
-          <w:sz w:val="26"/>
-        </w:rPr>
-        <w:t xml:space="preserve">  Giao bài tập về nhà bối cảnh thực tế.</w:t>
-      </w:r>
-    </w:p>
-    <w:p>
-      <w:pPr>
-        <w:spacing w:before="120" w:after="120"/>
-        <w:jc w:val="center"/>
-      </w:pPr>
-      <w:r>
-        <w:rPr>
-          <w:color w:val="BFBFBF"/>
-          <w:sz w:val="16"/>
-        </w:rPr>
-        <w:t>——————————————————————————————————————————————————————————————————————</w:t>
-      </w:r>
-    </w:p>
-    <w:p>
-      <w:pPr>
-        <w:jc w:val="right"/>
-      </w:pPr>
-      <w:r>
-        <w:rPr>
-          <w:rFonts w:ascii="Times New Roman" w:hAnsi="Times New Roman"/>
-          <w:i/>
-          <w:color w:val="212121"/>
-          <w:sz w:val="26"/>
-        </w:rPr>
-        <w:t>........., ngày ....... tháng ....... năm 20.......</w:t>
-      </w:r>
-    </w:p>
-    <w:tbl>
-      <w:tblPr>
-        <w:jc w:val="center"/>
-        <w:tblLayout w:type="fixed"/>
-        <w:tblLook w:firstColumn="1" w:firstRow="1" w:lastColumn="0" w:lastRow="0" w:noHBand="0" w:noVBand="1" w:val="04A0"/>
-        <w:tblW w:w="9354" w:type="dxa"/>
-      </w:tblPr>
-      <w:tblGrid>
-        <w:gridCol w:w="4677"/>
-        <w:gridCol w:w="4677"/>
-      </w:tblGrid>
-      <w:tr>
-        <w:tc>
-          <w:tcPr>
-            <w:tcW w:type="dxa" w:w="4677"/>
+            <w:tcW w:type="dxa" w:w="3061"/>
             <w:tcBorders>
               <w:top w:val="none"/>
               <w:left w:val="none"/>
@@ -1342,53 +1974,30 @@
           </w:tcPr>
           <w:p>
             <w:pPr>
+              <w:spacing w:before="80" w:after="80"/>
               <w:jc w:val="center"/>
             </w:pPr>
             <w:r>
               <w:rPr>
                 <w:rFonts w:ascii="Times New Roman" w:hAnsi="Times New Roman"/>
                 <w:b/>
-                <w:color w:val="212121"/>
-                <w:sz w:val="26"/>
-              </w:rPr>
-              <w:t>XÁC NHẬN CỦA TỔ CHUYÊN MÔN</w:t>
-            </w:r>
-          </w:p>
-          <w:p>
-            <w:pPr>
-              <w:jc w:val="center"/>
-            </w:pPr>
-            <w:r>
-              <w:rPr>
-                <w:rFonts w:ascii="Times New Roman" w:hAnsi="Times New Roman"/>
-                <w:i/>
-                <w:color w:val="595959"/>
+                <w:color w:val="000000"/>
                 <w:sz w:val="22"/>
               </w:rPr>
+              <w:t>GIÁO VIÊN SOẠN BÀI</w:t>
+              <w:br/>
               <w:t>(Ký và ghi rõ họ tên)</w:t>
             </w:r>
           </w:p>
-          <w:p/>
-          <w:p/>
-          <w:p/>
-          <w:p/>
-          <w:p>
-            <w:pPr>
-              <w:jc w:val="center"/>
-            </w:pPr>
-            <w:r>
-              <w:rPr>
-                <w:rFonts w:ascii="Times New Roman" w:hAnsi="Times New Roman"/>
-                <w:color w:val="595959"/>
-                <w:sz w:val="26"/>
-              </w:rPr>
-              <w:t>.................................</w:t>
-            </w:r>
-          </w:p>
         </w:tc>
+      </w:tr>
+      <w:tr>
+        <w:trPr>
+          <w:cantSplit/>
+        </w:trPr>
         <w:tc>
           <w:tcPr>
-            <w:tcW w:type="dxa" w:w="4677"/>
+            <w:tcW w:type="dxa" w:w="3005"/>
             <w:tcBorders>
               <w:top w:val="none"/>
               <w:left w:val="none"/>
@@ -1398,47 +2007,66 @@
           </w:tcPr>
           <w:p>
             <w:pPr>
+              <w:spacing w:before="900" w:after="80"/>
               <w:jc w:val="center"/>
             </w:pPr>
             <w:r>
               <w:rPr>
                 <w:rFonts w:ascii="Times New Roman" w:hAnsi="Times New Roman"/>
-                <w:b/>
-                <w:color w:val="212121"/>
-                <w:sz w:val="26"/>
+                <w:color w:val="666666"/>
+                <w:sz w:val="22"/>
               </w:rPr>
-              <w:t>GIÁO VIÊN SOẠN</w:t>
+              <w:t>..................................................</w:t>
             </w:r>
           </w:p>
+        </w:tc>
+        <w:tc>
+          <w:tcPr>
+            <w:tcW w:type="dxa" w:w="3005"/>
+            <w:tcBorders>
+              <w:top w:val="none"/>
+              <w:left w:val="none"/>
+              <w:bottom w:val="none"/>
+              <w:right w:val="none"/>
+            </w:tcBorders>
+          </w:tcPr>
           <w:p>
             <w:pPr>
+              <w:spacing w:before="900" w:after="80"/>
               <w:jc w:val="center"/>
             </w:pPr>
             <w:r>
               <w:rPr>
                 <w:rFonts w:ascii="Times New Roman" w:hAnsi="Times New Roman"/>
-                <w:i/>
-                <w:color w:val="595959"/>
+                <w:color w:val="666666"/>
                 <w:sz w:val="22"/>
               </w:rPr>
-              <w:t>(Ký và ghi rõ họ tên)</w:t>
+              <w:t>..................................................</w:t>
             </w:r>
           </w:p>
-          <w:p/>
-          <w:p/>
-          <w:p/>
-          <w:p/>
+        </w:tc>
+        <w:tc>
+          <w:tcPr>
+            <w:tcW w:type="dxa" w:w="3061"/>
+            <w:tcBorders>
+              <w:top w:val="none"/>
+              <w:left w:val="none"/>
+              <w:bottom w:val="none"/>
+              <w:right w:val="none"/>
+            </w:tcBorders>
+          </w:tcPr>
           <w:p>
             <w:pPr>
+              <w:spacing w:before="900" w:after="80"/>
               <w:jc w:val="center"/>
             </w:pPr>
             <w:r>
               <w:rPr>
                 <w:rFonts w:ascii="Times New Roman" w:hAnsi="Times New Roman"/>
-                <w:color w:val="595959"/>
-                <w:sz w:val="26"/>
+                <w:color w:val="666666"/>
+                <w:sz w:val="22"/>
               </w:rPr>
-              <w:t>.................................</w:t>
+              <w:t>..................................................</w:t>
             </w:r>
           </w:p>
         </w:tc>
@@ -1447,7 +2075,7 @@
     <w:sectPr>
       <w:footerReference w:type="default" r:id="rId9"/>
       <w:pgSz w:w="11906" w:h="16838"/>
-      <w:pgMar w:top="1134" w:right="850" w:bottom="1134" w:left="1701" w:header="720" w:footer="720" w:gutter="0"/>
+      <w:pgMar w:top="1134" w:right="1134" w:bottom="1134" w:left="1701" w:header="720" w:footer="720" w:gutter="0"/>
       <w:cols w:space="720"/>
       <w:docGrid w:linePitch="360"/>
     </w:sectPr>
@@ -1460,14 +2088,15 @@
   <w:p>
     <w:pPr>
       <w:pStyle w:val="Footer"/>
+      <w:spacing w:before="80" w:after="80"/>
       <w:jc w:val="center"/>
     </w:pPr>
     <w:r/>
     <w:r>
       <w:rPr>
         <w:rFonts w:ascii="Times New Roman" w:hAnsi="Times New Roman"/>
-        <w:color w:val="595959"/>
-        <w:sz w:val="20"/>
+        <w:color w:val="666666"/>
+        <w:sz w:val="18"/>
       </w:rPr>
       <w:t xml:space="preserve">Trang </w:t>
     </w:r>
@@ -1475,10 +2104,10 @@
     <w:r>
       <w:rPr>
         <w:rFonts w:ascii="Times New Roman" w:hAnsi="Times New Roman"/>
-        <w:color w:val="595959"/>
-        <w:sz w:val="20"/>
-      </w:rPr>
-      <w:t xml:space="preserve"> / </w:t>
+        <w:color w:val="666666"/>
+        <w:sz w:val="18"/>
+      </w:rPr>
+      <w:t>/</w:t>
     </w:r>
     <w:fldSimple w:instr="NUMPAGES"/>
   </w:p>
@@ -1849,12 +2478,12 @@
     <w:qFormat/>
     <w:rsid w:val="00FC693F"/>
     <w:pPr>
-      <w:spacing w:after="80" w:line="276" w:lineRule="auto"/>
+      <w:spacing w:before="120" w:after="120" w:line="312" w:lineRule="auto"/>
       <w:jc w:val="both"/>
     </w:pPr>
     <w:rPr>
       <w:rFonts w:ascii="Times New Roman" w:hAnsi="Times New Roman"/>
-      <w:color w:val="212121"/>
+      <w:color w:val="000000"/>
       <w:sz w:val="26"/>
     </w:rPr>
   </w:style>

</xml_diff>